<commit_message>
Added python singleton pattern and slightly edited __init__
</commit_message>
<xml_diff>
--- a/python/p4_python_OOP.docx
+++ b/python/p4_python_OOP.docx
@@ -862,7 +862,17 @@
           <w:sz w:val="32"/>
           <w:szCs w:val="32"/>
         </w:rPr>
-        <w:t>Object</w:t>
+        <w:t>o</w:t>
+      </w:r>
+      <w:r>
+        <w:rPr>
+          <w:b/>
+          <w:bCs/>
+          <w:color w:val="D86DCB" w:themeColor="accent5" w:themeTint="99"/>
+          <w:sz w:val="32"/>
+          <w:szCs w:val="32"/>
+        </w:rPr>
+        <w:t>bject</w:t>
       </w:r>
       <w:r>
         <w:rPr>
@@ -2347,7 +2357,21 @@
           <w:sz w:val="32"/>
           <w:szCs w:val="32"/>
         </w:rPr>
-        <w:t xml:space="preserve">in parameter. </w:t>
+        <w:t>in parameter</w:t>
+      </w:r>
+      <w:r>
+        <w:rPr>
+          <w:sz w:val="32"/>
+          <w:szCs w:val="32"/>
+        </w:rPr>
+        <w:t xml:space="preserve"> (takes the object or instance)</w:t>
+      </w:r>
+      <w:r>
+        <w:rPr>
+          <w:sz w:val="32"/>
+          <w:szCs w:val="32"/>
+        </w:rPr>
+        <w:t xml:space="preserve">. </w:t>
       </w:r>
       <w:r>
         <w:rPr>
@@ -2363,7 +2387,7 @@
           <w:sz w:val="32"/>
           <w:szCs w:val="32"/>
         </w:rPr>
-        <w:t xml:space="preserve"> creates own variables for different objects.</w:t>
+        <w:t xml:space="preserve"> creates own variables for different objects</w:t>
       </w:r>
     </w:p>
     <w:p>
@@ -2431,7 +2455,7 @@
           <w:sz w:val="32"/>
           <w:szCs w:val="32"/>
         </w:rPr>
-        <w:t xml:space="preserve"> creates a global variable </w:t>
+        <w:t xml:space="preserve"> creates a variable </w:t>
       </w:r>
       <w:r>
         <w:rPr>
@@ -2447,7 +2471,21 @@
           <w:sz w:val="32"/>
           <w:szCs w:val="32"/>
         </w:rPr>
-        <w:t xml:space="preserve"> which is globally available in th</w:t>
+        <w:t xml:space="preserve"> </w:t>
+      </w:r>
+      <w:r>
+        <w:rPr>
+          <w:sz w:val="32"/>
+          <w:szCs w:val="32"/>
+        </w:rPr>
+        <w:t>using Adding Additional Attributes (from above). W</w:t>
+      </w:r>
+      <w:r>
+        <w:rPr>
+          <w:sz w:val="32"/>
+          <w:szCs w:val="32"/>
+        </w:rPr>
+        <w:t>hich is available in th</w:t>
       </w:r>
       <w:r>
         <w:rPr>
@@ -2468,7 +2506,37 @@
           <w:sz w:val="32"/>
           <w:szCs w:val="32"/>
         </w:rPr>
-        <w:t xml:space="preserve"> like this:</w:t>
+        <w:t>es all of the methods</w:t>
+      </w:r>
+      <w:r>
+        <w:rPr>
+          <w:sz w:val="32"/>
+          <w:szCs w:val="32"/>
+        </w:rPr>
+        <w:t xml:space="preserve"> </w:t>
+      </w:r>
+      <w:r>
+        <w:rPr>
+          <w:sz w:val="32"/>
+          <w:szCs w:val="32"/>
+        </w:rPr>
+        <w:t xml:space="preserve">by passing the object itself as parameter and different </w:t>
+      </w:r>
+      <w:r>
+        <w:rPr>
+          <w:b/>
+          <w:bCs/>
+          <w:sz w:val="32"/>
+          <w:szCs w:val="32"/>
+        </w:rPr>
+        <w:t>name</w:t>
+      </w:r>
+      <w:r>
+        <w:rPr>
+          <w:sz w:val="32"/>
+          <w:szCs w:val="32"/>
+        </w:rPr>
+        <w:t xml:space="preserve"> depending on different object</w:t>
       </w:r>
     </w:p>
     <w:p>
@@ -2508,30 +2576,133 @@
           <w:sz w:val="32"/>
           <w:szCs w:val="32"/>
         </w:rPr>
-        <w:t xml:space="preserve">    name = ' '</w:t>
-      </w:r>
-    </w:p>
-    <w:p>
-      <w:pPr>
-        <w:jc w:val="both"/>
-        <w:rPr>
-          <w:sz w:val="32"/>
-          <w:szCs w:val="32"/>
-        </w:rPr>
-      </w:pPr>
-      <w:r>
-        <w:rPr>
-          <w:sz w:val="32"/>
-          <w:szCs w:val="32"/>
-        </w:rPr>
-        <w:t xml:space="preserve"># Then </w:t>
-      </w:r>
-      <w:r>
-        <w:rPr>
-          <w:sz w:val="32"/>
-          <w:szCs w:val="32"/>
-        </w:rPr>
-        <w:t xml:space="preserve">we can use it like this </w:t>
+        <w:t xml:space="preserve">    </w:t>
+      </w:r>
+      <w:r>
+        <w:rPr>
+          <w:b/>
+          <w:bCs/>
+          <w:sz w:val="32"/>
+          <w:szCs w:val="32"/>
+        </w:rPr>
+        <w:t>def __</w:t>
+      </w:r>
+      <w:proofErr w:type="spellStart"/>
+      <w:r>
+        <w:rPr>
+          <w:b/>
+          <w:bCs/>
+          <w:sz w:val="32"/>
+          <w:szCs w:val="32"/>
+        </w:rPr>
+        <w:t>init</w:t>
+      </w:r>
+      <w:proofErr w:type="spellEnd"/>
+      <w:r>
+        <w:rPr>
+          <w:b/>
+          <w:bCs/>
+          <w:sz w:val="32"/>
+          <w:szCs w:val="32"/>
+        </w:rPr>
+        <w:t>__(object):</w:t>
+      </w:r>
+    </w:p>
+    <w:p>
+      <w:pPr>
+        <w:jc w:val="both"/>
+        <w:rPr>
+          <w:b/>
+          <w:bCs/>
+          <w:sz w:val="32"/>
+          <w:szCs w:val="32"/>
+        </w:rPr>
+      </w:pPr>
+      <w:r>
+        <w:rPr>
+          <w:b/>
+          <w:bCs/>
+          <w:sz w:val="32"/>
+          <w:szCs w:val="32"/>
+        </w:rPr>
+        <w:t xml:space="preserve">    </w:t>
+      </w:r>
+      <w:r>
+        <w:rPr>
+          <w:b/>
+          <w:bCs/>
+          <w:sz w:val="32"/>
+          <w:szCs w:val="32"/>
+        </w:rPr>
+        <w:t xml:space="preserve">    </w:t>
+      </w:r>
+      <w:r>
+        <w:rPr>
+          <w:b/>
+          <w:bCs/>
+          <w:sz w:val="32"/>
+          <w:szCs w:val="32"/>
+        </w:rPr>
+        <w:t>object.</w:t>
+      </w:r>
+      <w:r>
+        <w:rPr>
+          <w:b/>
+          <w:bCs/>
+          <w:sz w:val="32"/>
+          <w:szCs w:val="32"/>
+        </w:rPr>
+        <w:t>name = '</w:t>
+      </w:r>
+      <w:r>
+        <w:rPr>
+          <w:b/>
+          <w:bCs/>
+          <w:sz w:val="32"/>
+          <w:szCs w:val="32"/>
+        </w:rPr>
+        <w:t>…</w:t>
+      </w:r>
+      <w:r>
+        <w:rPr>
+          <w:b/>
+          <w:bCs/>
+          <w:sz w:val="32"/>
+          <w:szCs w:val="32"/>
+        </w:rPr>
+        <w:t xml:space="preserve"> '</w:t>
+      </w:r>
+      <w:r>
+        <w:rPr>
+          <w:b/>
+          <w:bCs/>
+          <w:sz w:val="32"/>
+          <w:szCs w:val="32"/>
+        </w:rPr>
+        <w:t xml:space="preserve">       # Only for that object or instance</w:t>
+      </w:r>
+    </w:p>
+    <w:p>
+      <w:pPr>
+        <w:jc w:val="both"/>
+        <w:rPr>
+          <w:sz w:val="32"/>
+          <w:szCs w:val="32"/>
+        </w:rPr>
+      </w:pPr>
+      <w:r>
+        <w:rPr>
+          <w:sz w:val="32"/>
+          <w:szCs w:val="32"/>
+        </w:rPr>
+        <w:t># Then</w:t>
+      </w:r>
+      <w:r>
+        <w:rPr>
+          <w:sz w:val="32"/>
+          <w:szCs w:val="32"/>
+        </w:rPr>
+        <w:t xml:space="preserve"> use it like this </w:t>
       </w:r>
       <w:r>
         <w:rPr>
@@ -2542,6 +2713,74 @@
         </w:rPr>
         <w:t>self.name</w:t>
       </w:r>
+      <w:r>
+        <w:rPr>
+          <w:b/>
+          <w:bCs/>
+          <w:sz w:val="32"/>
+          <w:szCs w:val="32"/>
+        </w:rPr>
+        <w:t xml:space="preserve"> </w:t>
+      </w:r>
+      <w:r>
+        <w:rPr>
+          <w:sz w:val="32"/>
+          <w:szCs w:val="32"/>
+        </w:rPr>
+        <w:t>because in method call (</w:t>
+      </w:r>
+      <w:r>
+        <w:rPr>
+          <w:b/>
+          <w:bCs/>
+          <w:sz w:val="32"/>
+          <w:szCs w:val="32"/>
+        </w:rPr>
+        <w:t>def get(self)</w:t>
+      </w:r>
+      <w:r>
+        <w:rPr>
+          <w:b/>
+          <w:bCs/>
+          <w:sz w:val="32"/>
+          <w:szCs w:val="32"/>
+        </w:rPr>
+        <w:t>:</w:t>
+      </w:r>
+      <w:r>
+        <w:rPr>
+          <w:sz w:val="32"/>
+          <w:szCs w:val="32"/>
+        </w:rPr>
+        <w:t>) passes the object (</w:t>
+      </w:r>
+      <w:proofErr w:type="spellStart"/>
+      <w:r>
+        <w:rPr>
+          <w:b/>
+          <w:bCs/>
+          <w:sz w:val="32"/>
+          <w:szCs w:val="32"/>
+        </w:rPr>
+        <w:t>Student.get</w:t>
+      </w:r>
+      <w:proofErr w:type="spellEnd"/>
+      <w:r>
+        <w:rPr>
+          <w:b/>
+          <w:bCs/>
+          <w:sz w:val="32"/>
+          <w:szCs w:val="32"/>
+        </w:rPr>
+        <w:t>(student)</w:t>
+      </w:r>
+      <w:r>
+        <w:rPr>
+          <w:sz w:val="32"/>
+          <w:szCs w:val="32"/>
+        </w:rPr>
+        <w:t>) itself which has its specific properties the method can access (SEE BELOW)</w:t>
+      </w:r>
     </w:p>
     <w:p>
       <w:pPr>
@@ -2765,6 +3004,7 @@
           <w:sz w:val="32"/>
           <w:szCs w:val="32"/>
         </w:rPr>
+        <w:lastRenderedPageBreak/>
         <w:t xml:space="preserve">        </w:t>
       </w:r>
       <w:proofErr w:type="spellStart"/>
@@ -2922,7 +3162,6 @@
           <w:sz w:val="32"/>
           <w:szCs w:val="32"/>
         </w:rPr>
-        <w:lastRenderedPageBreak/>
         <w:t>print(</w:t>
       </w:r>
       <w:proofErr w:type="gramEnd"/>
@@ -2979,6 +3218,184 @@
           <w:szCs w:val="32"/>
         </w:rPr>
       </w:pPr>
+      <w:r>
+        <w:rPr>
+          <w:b/>
+          <w:bCs/>
+          <w:sz w:val="32"/>
+          <w:szCs w:val="32"/>
+        </w:rPr>
+        <w:t xml:space="preserve">NOTE: </w:t>
+      </w:r>
+      <w:r>
+        <w:rPr>
+          <w:sz w:val="32"/>
+          <w:szCs w:val="32"/>
+        </w:rPr>
+        <w:t xml:space="preserve">If we don’t use </w:t>
+      </w:r>
+      <w:r>
+        <w:rPr>
+          <w:b/>
+          <w:bCs/>
+          <w:sz w:val="32"/>
+          <w:szCs w:val="32"/>
+        </w:rPr>
+        <w:t>self</w:t>
+      </w:r>
+      <w:r>
+        <w:rPr>
+          <w:sz w:val="32"/>
+          <w:szCs w:val="32"/>
+        </w:rPr>
+        <w:t>-keyword in</w:t>
+      </w:r>
+      <w:r>
+        <w:rPr>
+          <w:b/>
+          <w:bCs/>
+          <w:sz w:val="32"/>
+          <w:szCs w:val="32"/>
+        </w:rPr>
+        <w:t xml:space="preserve"> _ _</w:t>
+      </w:r>
+      <w:proofErr w:type="spellStart"/>
+      <w:r>
+        <w:rPr>
+          <w:b/>
+          <w:bCs/>
+          <w:sz w:val="32"/>
+          <w:szCs w:val="32"/>
+        </w:rPr>
+        <w:t>init</w:t>
+      </w:r>
+      <w:proofErr w:type="spellEnd"/>
+      <w:r>
+        <w:rPr>
+          <w:b/>
+          <w:bCs/>
+          <w:sz w:val="32"/>
+          <w:szCs w:val="32"/>
+        </w:rPr>
+        <w:t>_ _</w:t>
+      </w:r>
+      <w:r>
+        <w:rPr>
+          <w:sz w:val="32"/>
+          <w:szCs w:val="32"/>
+        </w:rPr>
+        <w:t xml:space="preserve"> constructor then the initialized variable’s (</w:t>
+      </w:r>
+      <w:r>
+        <w:rPr>
+          <w:b/>
+          <w:bCs/>
+          <w:sz w:val="32"/>
+          <w:szCs w:val="32"/>
+        </w:rPr>
+        <w:t>name</w:t>
+      </w:r>
+      <w:r>
+        <w:rPr>
+          <w:sz w:val="32"/>
+          <w:szCs w:val="32"/>
+        </w:rPr>
+        <w:t>) value will be shared by all the objects or instances of that class. Because it will be class level property not individual object level</w:t>
+      </w:r>
+    </w:p>
+    <w:p>
+      <w:pPr>
+        <w:jc w:val="both"/>
+        <w:rPr>
+          <w:b/>
+          <w:bCs/>
+          <w:sz w:val="32"/>
+          <w:szCs w:val="32"/>
+        </w:rPr>
+      </w:pPr>
+      <w:r>
+        <w:rPr>
+          <w:b/>
+          <w:bCs/>
+          <w:sz w:val="32"/>
+          <w:szCs w:val="32"/>
+        </w:rPr>
+        <w:t>class Student:</w:t>
+      </w:r>
+    </w:p>
+    <w:p>
+      <w:pPr>
+        <w:jc w:val="both"/>
+        <w:rPr>
+          <w:b/>
+          <w:bCs/>
+          <w:sz w:val="32"/>
+          <w:szCs w:val="32"/>
+        </w:rPr>
+      </w:pPr>
+      <w:r>
+        <w:rPr>
+          <w:b/>
+          <w:bCs/>
+          <w:sz w:val="32"/>
+          <w:szCs w:val="32"/>
+        </w:rPr>
+        <w:t xml:space="preserve">    name = '</w:t>
+      </w:r>
+      <w:r>
+        <w:rPr>
+          <w:b/>
+          <w:bCs/>
+          <w:sz w:val="32"/>
+          <w:szCs w:val="32"/>
+        </w:rPr>
+        <w:t>…</w:t>
+      </w:r>
+      <w:r>
+        <w:rPr>
+          <w:b/>
+          <w:bCs/>
+          <w:sz w:val="32"/>
+          <w:szCs w:val="32"/>
+        </w:rPr>
+        <w:t xml:space="preserve"> '</w:t>
+      </w:r>
+      <w:r>
+        <w:rPr>
+          <w:b/>
+          <w:bCs/>
+          <w:sz w:val="32"/>
+          <w:szCs w:val="32"/>
+        </w:rPr>
+        <w:t xml:space="preserve">       # </w:t>
+      </w:r>
+      <w:r>
+        <w:rPr>
+          <w:b/>
+          <w:bCs/>
+          <w:sz w:val="32"/>
+          <w:szCs w:val="32"/>
+        </w:rPr>
+        <w:t>shared by all</w:t>
+      </w:r>
+      <w:r>
+        <w:rPr>
+          <w:b/>
+          <w:bCs/>
+          <w:sz w:val="32"/>
+          <w:szCs w:val="32"/>
+        </w:rPr>
+        <w:t xml:space="preserve"> object or instance</w:t>
+      </w:r>
+    </w:p>
+    <w:p>
+      <w:pPr>
+        <w:jc w:val="both"/>
+        <w:rPr>
+          <w:sz w:val="32"/>
+          <w:szCs w:val="32"/>
+        </w:rPr>
+      </w:pPr>
     </w:p>
     <w:p>
       <w:pPr>
@@ -3032,7 +3449,35 @@
           <w:sz w:val="32"/>
           <w:szCs w:val="32"/>
         </w:rPr>
-        <w:t>, methods wouldn't know which object's attributes to use.</w:t>
+        <w:t>, methods</w:t>
+      </w:r>
+      <w:r>
+        <w:rPr>
+          <w:sz w:val="32"/>
+          <w:szCs w:val="32"/>
+        </w:rPr>
+        <w:t xml:space="preserve"> (describe)</w:t>
+      </w:r>
+      <w:r>
+        <w:rPr>
+          <w:sz w:val="32"/>
+          <w:szCs w:val="32"/>
+        </w:rPr>
+        <w:t xml:space="preserve"> wouldn't know which object's attributes</w:t>
+      </w:r>
+      <w:r>
+        <w:rPr>
+          <w:sz w:val="32"/>
+          <w:szCs w:val="32"/>
+        </w:rPr>
+        <w:t xml:space="preserve"> or property</w:t>
+      </w:r>
+      <w:r>
+        <w:rPr>
+          <w:sz w:val="32"/>
+          <w:szCs w:val="32"/>
+        </w:rPr>
+        <w:t xml:space="preserve"> to use.</w:t>
       </w:r>
       <w:r>
         <w:rPr>
@@ -3278,54 +3723,64 @@
           <w:sz w:val="32"/>
           <w:szCs w:val="32"/>
         </w:rPr>
+        <w:t>print(self.name);</w:t>
+      </w:r>
+    </w:p>
+    <w:p>
+      <w:pPr>
+        <w:jc w:val="both"/>
+        <w:rPr>
+          <w:b/>
+          <w:bCs/>
+          <w:color w:val="D86DCB" w:themeColor="accent5" w:themeTint="99"/>
+          <w:sz w:val="32"/>
+          <w:szCs w:val="32"/>
+        </w:rPr>
+      </w:pPr>
+      <w:proofErr w:type="spellStart"/>
+      <w:r>
+        <w:rPr>
+          <w:b/>
+          <w:bCs/>
+          <w:color w:val="D86DCB" w:themeColor="accent5" w:themeTint="99"/>
+          <w:sz w:val="32"/>
+          <w:szCs w:val="32"/>
+        </w:rPr>
+        <w:t>my_car</w:t>
+      </w:r>
+      <w:proofErr w:type="spellEnd"/>
+      <w:r>
+        <w:rPr>
+          <w:b/>
+          <w:bCs/>
+          <w:color w:val="D86DCB" w:themeColor="accent5" w:themeTint="99"/>
+          <w:sz w:val="32"/>
+          <w:szCs w:val="32"/>
+        </w:rPr>
+        <w:t xml:space="preserve"> = </w:t>
+      </w:r>
+      <w:proofErr w:type="gramStart"/>
+      <w:r>
+        <w:rPr>
+          <w:b/>
+          <w:bCs/>
+          <w:color w:val="D86DCB" w:themeColor="accent5" w:themeTint="99"/>
+          <w:sz w:val="32"/>
+          <w:szCs w:val="32"/>
+        </w:rPr>
+        <w:t>Car(</w:t>
+      </w:r>
+      <w:proofErr w:type="gramEnd"/>
+      <w:r>
+        <w:rPr>
+          <w:b/>
+          <w:bCs/>
+          <w:color w:val="D86DCB" w:themeColor="accent5" w:themeTint="99"/>
+          <w:sz w:val="32"/>
+          <w:szCs w:val="32"/>
+        </w:rPr>
         <w:t>…</w:t>
       </w:r>
-    </w:p>
-    <w:p>
-      <w:pPr>
-        <w:jc w:val="both"/>
-        <w:rPr>
-          <w:b/>
-          <w:bCs/>
-          <w:color w:val="D86DCB" w:themeColor="accent5" w:themeTint="99"/>
-          <w:sz w:val="32"/>
-          <w:szCs w:val="32"/>
-        </w:rPr>
-      </w:pPr>
-      <w:proofErr w:type="spellStart"/>
-      <w:r>
-        <w:rPr>
-          <w:b/>
-          <w:bCs/>
-          <w:color w:val="D86DCB" w:themeColor="accent5" w:themeTint="99"/>
-          <w:sz w:val="32"/>
-          <w:szCs w:val="32"/>
-        </w:rPr>
-        <w:t>my_car</w:t>
-      </w:r>
-      <w:proofErr w:type="spellEnd"/>
-      <w:r>
-        <w:rPr>
-          <w:b/>
-          <w:bCs/>
-          <w:color w:val="D86DCB" w:themeColor="accent5" w:themeTint="99"/>
-          <w:sz w:val="32"/>
-          <w:szCs w:val="32"/>
-        </w:rPr>
-        <w:t xml:space="preserve"> = </w:t>
-      </w:r>
-      <w:proofErr w:type="gramStart"/>
-      <w:r>
-        <w:rPr>
-          <w:b/>
-          <w:bCs/>
-          <w:color w:val="D86DCB" w:themeColor="accent5" w:themeTint="99"/>
-          <w:sz w:val="32"/>
-          <w:szCs w:val="32"/>
-        </w:rPr>
-        <w:t>Car(</w:t>
-      </w:r>
-      <w:proofErr w:type="gramEnd"/>
       <w:r>
         <w:rPr>
           <w:b/>
@@ -3396,6 +3851,7 @@
           <w:sz w:val="32"/>
           <w:szCs w:val="32"/>
         </w:rPr>
+        <w:lastRenderedPageBreak/>
         <w:t xml:space="preserve"># Python </w:t>
       </w:r>
       <w:r>
@@ -3467,6 +3923,45 @@
           <w:szCs w:val="32"/>
         </w:rPr>
         <w:t>)</w:t>
+      </w:r>
+      <w:r>
+        <w:rPr>
+          <w:b/>
+          <w:bCs/>
+          <w:color w:val="D86DCB" w:themeColor="accent5" w:themeTint="99"/>
+          <w:sz w:val="32"/>
+          <w:szCs w:val="32"/>
+        </w:rPr>
+        <w:t>:</w:t>
+      </w:r>
+    </w:p>
+    <w:p>
+      <w:pPr>
+        <w:jc w:val="both"/>
+        <w:rPr>
+          <w:sz w:val="32"/>
+          <w:szCs w:val="32"/>
+        </w:rPr>
+      </w:pPr>
+      <w:r>
+        <w:rPr>
+          <w:b/>
+          <w:bCs/>
+          <w:color w:val="D86DCB" w:themeColor="accent5" w:themeTint="99"/>
+          <w:sz w:val="32"/>
+          <w:szCs w:val="32"/>
+        </w:rPr>
+        <w:t>        </w:t>
+      </w:r>
+      <w:r>
+        <w:rPr>
+          <w:b/>
+          <w:bCs/>
+          <w:color w:val="D86DCB" w:themeColor="accent5" w:themeTint="99"/>
+          <w:sz w:val="32"/>
+          <w:szCs w:val="32"/>
+        </w:rPr>
+        <w:t>print(my_car.name)</w:t>
       </w:r>
     </w:p>
     <w:p>
@@ -3719,7 +4214,6 @@
           <w:sz w:val="32"/>
           <w:szCs w:val="32"/>
         </w:rPr>
-        <w:lastRenderedPageBreak/>
         <w:t xml:space="preserve">    def sell(self):</w:t>
       </w:r>
     </w:p>
@@ -4001,7 +4495,15 @@
           <w:sz w:val="32"/>
           <w:szCs w:val="32"/>
         </w:rPr>
-        <w:t xml:space="preserve"> keyword allows a class or function to modify that variable rather than creating a new local one. It can also be used inside a class or function to create a new variable in the global scope if it does not already exist</w:t>
+        <w:t xml:space="preserve"> keyword allows a class or function to modify that variable rather than creating a new local one. It can also be used inside a </w:t>
+      </w:r>
+      <w:r>
+        <w:rPr>
+          <w:sz w:val="32"/>
+          <w:szCs w:val="32"/>
+        </w:rPr>
+        <w:lastRenderedPageBreak/>
+        <w:t>class or function to create a new variable in the global scope if it does not already exist</w:t>
       </w:r>
     </w:p>
     <w:bookmarkEnd w:id="0"/>
@@ -4317,7 +4819,6 @@
           <w:sz w:val="32"/>
           <w:szCs w:val="32"/>
         </w:rPr>
-        <w:lastRenderedPageBreak/>
         <w:t>Break</w:t>
       </w:r>
     </w:p>
@@ -4605,6 +5106,7 @@
           <w:sz w:val="28"/>
           <w:szCs w:val="28"/>
         </w:rPr>
+        <w:lastRenderedPageBreak/>
         <w:t xml:space="preserve">    </w:t>
       </w:r>
       <w:r>
@@ -5404,6 +5906,13 @@
         </w:rPr>
         <w:t># Used for computed attributes and validation</w:t>
       </w:r>
+      <w:r>
+        <w:rPr>
+          <w:sz w:val="32"/>
+          <w:szCs w:val="32"/>
+        </w:rPr>
+        <w:t xml:space="preserve"> (encapsulation too)</w:t>
+      </w:r>
     </w:p>
     <w:p>
       <w:pPr>
@@ -5532,6 +6041,7 @@
           <w:sz w:val="32"/>
           <w:szCs w:val="32"/>
         </w:rPr>
+        <w:lastRenderedPageBreak/>
         <w:t xml:space="preserve">        </w:t>
       </w:r>
       <w:proofErr w:type="spellStart"/>
@@ -5812,7 +6322,6 @@
           <w:sz w:val="32"/>
           <w:szCs w:val="32"/>
         </w:rPr>
-        <w:lastRenderedPageBreak/>
         <w:t xml:space="preserve">            </w:t>
       </w:r>
       <w:proofErr w:type="spellStart"/>
@@ -6286,6 +6795,7 @@
           <w:sz w:val="32"/>
           <w:szCs w:val="32"/>
         </w:rPr>
+        <w:lastRenderedPageBreak/>
         <w:t>@property</w:t>
       </w:r>
     </w:p>
@@ -6828,6 +7338,7 @@
           <w:sz w:val="32"/>
           <w:szCs w:val="32"/>
         </w:rPr>
+        <w:lastRenderedPageBreak/>
         <w:t xml:space="preserve">person1 = </w:t>
       </w:r>
       <w:proofErr w:type="gramStart"/>
@@ -7019,6 +7530,159 @@
           <w:szCs w:val="32"/>
         </w:rPr>
         <w:t>person2.total) # 2</w:t>
+      </w:r>
+    </w:p>
+    <w:p>
+      <w:pPr>
+        <w:jc w:val="both"/>
+        <w:rPr>
+          <w:sz w:val="32"/>
+          <w:szCs w:val="32"/>
+        </w:rPr>
+      </w:pPr>
+      <w:r>
+        <w:rPr>
+          <w:sz w:val="32"/>
+          <w:szCs w:val="32"/>
+        </w:rPr>
+        <w:t># Internally, Python does this:</w:t>
+      </w:r>
+    </w:p>
+    <w:p>
+      <w:pPr>
+        <w:jc w:val="both"/>
+        <w:rPr>
+          <w:b/>
+          <w:bCs/>
+          <w:color w:val="D86DCB" w:themeColor="accent5" w:themeTint="99"/>
+          <w:sz w:val="32"/>
+          <w:szCs w:val="32"/>
+        </w:rPr>
+      </w:pPr>
+      <w:proofErr w:type="spellStart"/>
+      <w:r>
+        <w:rPr>
+          <w:b/>
+          <w:bCs/>
+          <w:color w:val="D86DCB" w:themeColor="accent5" w:themeTint="99"/>
+          <w:sz w:val="32"/>
+          <w:szCs w:val="32"/>
+        </w:rPr>
+        <w:t>Person</w:t>
+      </w:r>
+      <w:r>
+        <w:rPr>
+          <w:b/>
+          <w:bCs/>
+          <w:color w:val="D86DCB" w:themeColor="accent5" w:themeTint="99"/>
+          <w:sz w:val="32"/>
+          <w:szCs w:val="32"/>
+        </w:rPr>
+        <w:t>.</w:t>
+      </w:r>
+      <w:r>
+        <w:rPr>
+          <w:b/>
+          <w:bCs/>
+          <w:color w:val="D86DCB" w:themeColor="accent5" w:themeTint="99"/>
+          <w:sz w:val="32"/>
+          <w:szCs w:val="32"/>
+        </w:rPr>
+        <w:t>increase</w:t>
+      </w:r>
+      <w:proofErr w:type="spellEnd"/>
+      <w:r>
+        <w:rPr>
+          <w:b/>
+          <w:bCs/>
+          <w:color w:val="D86DCB" w:themeColor="accent5" w:themeTint="99"/>
+          <w:sz w:val="32"/>
+          <w:szCs w:val="32"/>
+        </w:rPr>
+        <w:t>(Person</w:t>
+      </w:r>
+      <w:r>
+        <w:rPr>
+          <w:b/>
+          <w:bCs/>
+          <w:color w:val="D86DCB" w:themeColor="accent5" w:themeTint="99"/>
+          <w:sz w:val="32"/>
+          <w:szCs w:val="32"/>
+        </w:rPr>
+        <w:t>)</w:t>
+      </w:r>
+      <w:r>
+        <w:rPr>
+          <w:b/>
+          <w:bCs/>
+          <w:color w:val="D86DCB" w:themeColor="accent5" w:themeTint="99"/>
+          <w:sz w:val="32"/>
+          <w:szCs w:val="32"/>
+        </w:rPr>
+        <w:t>:</w:t>
+      </w:r>
+    </w:p>
+    <w:p>
+      <w:pPr>
+        <w:jc w:val="both"/>
+        <w:rPr>
+          <w:sz w:val="32"/>
+          <w:szCs w:val="32"/>
+        </w:rPr>
+      </w:pPr>
+      <w:r>
+        <w:rPr>
+          <w:b/>
+          <w:bCs/>
+          <w:color w:val="D86DCB" w:themeColor="accent5" w:themeTint="99"/>
+          <w:sz w:val="32"/>
+          <w:szCs w:val="32"/>
+        </w:rPr>
+        <w:t>        </w:t>
+      </w:r>
+      <w:proofErr w:type="spellStart"/>
+      <w:r>
+        <w:rPr>
+          <w:b/>
+          <w:bCs/>
+          <w:color w:val="D86DCB" w:themeColor="accent5" w:themeTint="99"/>
+          <w:sz w:val="32"/>
+          <w:szCs w:val="32"/>
+        </w:rPr>
+        <w:t>Personal.total</w:t>
+      </w:r>
+      <w:proofErr w:type="spellEnd"/>
+      <w:r>
+        <w:rPr>
+          <w:b/>
+          <w:bCs/>
+          <w:color w:val="D86DCB" w:themeColor="accent5" w:themeTint="99"/>
+          <w:sz w:val="32"/>
+          <w:szCs w:val="32"/>
+        </w:rPr>
+        <w:t xml:space="preserve"> += </w:t>
+      </w:r>
+      <w:proofErr w:type="gramStart"/>
+      <w:r>
+        <w:rPr>
+          <w:b/>
+          <w:bCs/>
+          <w:color w:val="D86DCB" w:themeColor="accent5" w:themeTint="99"/>
+          <w:sz w:val="32"/>
+          <w:szCs w:val="32"/>
+        </w:rPr>
+        <w:t>1  #</w:t>
+      </w:r>
+      <w:proofErr w:type="gramEnd"/>
+      <w:r>
+        <w:rPr>
+          <w:b/>
+          <w:bCs/>
+          <w:color w:val="D86DCB" w:themeColor="accent5" w:themeTint="99"/>
+          <w:sz w:val="32"/>
+          <w:szCs w:val="32"/>
+        </w:rPr>
+        <w:t xml:space="preserve"> Shared and accessed by all instances</w:t>
       </w:r>
     </w:p>
     <w:p>
@@ -7087,7 +7751,6 @@
                 <w:sz w:val="28"/>
                 <w:szCs w:val="28"/>
               </w:rPr>
-              <w:lastRenderedPageBreak/>
               <w:t>Type</w:t>
             </w:r>
           </w:p>
@@ -7976,229 +8639,229 @@
           <w:sz w:val="32"/>
           <w:szCs w:val="32"/>
         </w:rPr>
+        <w:t>Student.grade</w:t>
+      </w:r>
+      <w:proofErr w:type="spellEnd"/>
+      <w:r>
+        <w:rPr>
+          <w:b/>
+          <w:bCs/>
+          <w:color w:val="D86DCB" w:themeColor="accent5" w:themeTint="99"/>
+          <w:sz w:val="32"/>
+          <w:szCs w:val="32"/>
+        </w:rPr>
+        <w:t>()</w:t>
+      </w:r>
+    </w:p>
+    <w:p>
+      <w:pPr>
+        <w:jc w:val="both"/>
+        <w:rPr>
+          <w:sz w:val="32"/>
+          <w:szCs w:val="32"/>
+        </w:rPr>
+      </w:pPr>
+      <w:r>
+        <w:rPr>
+          <w:sz w:val="32"/>
+          <w:szCs w:val="32"/>
+        </w:rPr>
+        <w:t xml:space="preserve"># </w:t>
+      </w:r>
+      <w:r>
+        <w:rPr>
+          <w:sz w:val="32"/>
+          <w:szCs w:val="32"/>
+        </w:rPr>
+        <w:t>Use it when the method doesn't use any instance or class data.</w:t>
+      </w:r>
+    </w:p>
+    <w:p>
+      <w:pPr>
+        <w:jc w:val="both"/>
+        <w:rPr>
+          <w:sz w:val="32"/>
+          <w:szCs w:val="32"/>
+        </w:rPr>
+      </w:pPr>
+    </w:p>
+    <w:p>
+      <w:pPr>
+        <w:jc w:val="center"/>
+        <w:rPr>
+          <w:sz w:val="32"/>
+          <w:szCs w:val="32"/>
+        </w:rPr>
+      </w:pPr>
+      <w:r>
+        <w:rPr>
+          <w:sz w:val="32"/>
+          <w:szCs w:val="32"/>
+        </w:rPr>
+        <w:t>Break</w:t>
+      </w:r>
+    </w:p>
+    <w:p>
+      <w:pPr>
+        <w:jc w:val="both"/>
+        <w:rPr>
+          <w:sz w:val="32"/>
+          <w:szCs w:val="32"/>
+        </w:rPr>
+      </w:pPr>
+    </w:p>
+    <w:p>
+      <w:pPr>
+        <w:jc w:val="both"/>
+        <w:rPr>
+          <w:sz w:val="32"/>
+          <w:szCs w:val="32"/>
+        </w:rPr>
+      </w:pPr>
+      <w:r>
+        <w:rPr>
+          <w:b/>
+          <w:bCs/>
+          <w:sz w:val="32"/>
+          <w:szCs w:val="32"/>
+        </w:rPr>
+        <w:t>Inheritance:</w:t>
+      </w:r>
+    </w:p>
+    <w:p>
+      <w:pPr>
+        <w:jc w:val="both"/>
+        <w:rPr>
+          <w:sz w:val="32"/>
+          <w:szCs w:val="32"/>
+        </w:rPr>
+      </w:pPr>
+      <w:r>
+        <w:rPr>
+          <w:sz w:val="32"/>
+          <w:szCs w:val="32"/>
+        </w:rPr>
+        <w:t># We can inherit a class just by-passing parent class (</w:t>
+      </w:r>
+      <w:r>
+        <w:rPr>
+          <w:b/>
+          <w:bCs/>
+          <w:sz w:val="32"/>
+          <w:szCs w:val="32"/>
+        </w:rPr>
+        <w:t>Animal</w:t>
+      </w:r>
+      <w:r>
+        <w:rPr>
+          <w:sz w:val="32"/>
+          <w:szCs w:val="32"/>
+        </w:rPr>
+        <w:t>) to the child class (</w:t>
+      </w:r>
+      <w:r>
+        <w:rPr>
+          <w:b/>
+          <w:bCs/>
+          <w:sz w:val="32"/>
+          <w:szCs w:val="32"/>
+        </w:rPr>
+        <w:t>Dog</w:t>
+      </w:r>
+      <w:r>
+        <w:rPr>
+          <w:sz w:val="32"/>
+          <w:szCs w:val="32"/>
+        </w:rPr>
+        <w:t>) in parentheses</w:t>
+      </w:r>
+      <w:r>
+        <w:rPr>
+          <w:b/>
+          <w:bCs/>
+          <w:sz w:val="32"/>
+          <w:szCs w:val="32"/>
+        </w:rPr>
+        <w:t xml:space="preserve"> ()</w:t>
+      </w:r>
+      <w:r>
+        <w:rPr>
+          <w:sz w:val="32"/>
+          <w:szCs w:val="32"/>
+        </w:rPr>
+        <w:t xml:space="preserve"> when creating the child class.</w:t>
+      </w:r>
+    </w:p>
+    <w:p>
+      <w:pPr>
+        <w:jc w:val="both"/>
+        <w:rPr>
+          <w:b/>
+          <w:bCs/>
+          <w:sz w:val="32"/>
+          <w:szCs w:val="32"/>
+        </w:rPr>
+      </w:pPr>
+      <w:r>
+        <w:rPr>
+          <w:sz w:val="32"/>
+          <w:szCs w:val="32"/>
+        </w:rPr>
+        <w:t xml:space="preserve"># </w:t>
+      </w:r>
+      <w:r>
+        <w:rPr>
+          <w:sz w:val="32"/>
+          <w:szCs w:val="32"/>
+        </w:rPr>
+        <w:t xml:space="preserve">Child class </w:t>
+      </w:r>
+      <w:r>
+        <w:rPr>
+          <w:b/>
+          <w:bCs/>
+          <w:sz w:val="32"/>
+          <w:szCs w:val="32"/>
+        </w:rPr>
+        <w:t>Dog</w:t>
+      </w:r>
+      <w:r>
+        <w:rPr>
+          <w:sz w:val="32"/>
+          <w:szCs w:val="32"/>
+        </w:rPr>
+        <w:t xml:space="preserve"> will inherit all the things like properties and methods of the parent class </w:t>
+      </w:r>
+      <w:r>
+        <w:rPr>
+          <w:b/>
+          <w:bCs/>
+          <w:sz w:val="32"/>
+          <w:szCs w:val="32"/>
+        </w:rPr>
+        <w:t>Animal</w:t>
+      </w:r>
+    </w:p>
+    <w:p>
+      <w:pPr>
+        <w:jc w:val="both"/>
+        <w:rPr>
+          <w:b/>
+          <w:bCs/>
+          <w:color w:val="D86DCB" w:themeColor="accent5" w:themeTint="99"/>
+          <w:sz w:val="32"/>
+          <w:szCs w:val="32"/>
+        </w:rPr>
+      </w:pPr>
+      <w:r>
+        <w:rPr>
+          <w:b/>
+          <w:bCs/>
+          <w:color w:val="D86DCB" w:themeColor="accent5" w:themeTint="99"/>
+          <w:sz w:val="32"/>
+          <w:szCs w:val="32"/>
+        </w:rPr>
         <w:lastRenderedPageBreak/>
-        <w:t>Student.grade</w:t>
-      </w:r>
-      <w:proofErr w:type="spellEnd"/>
-      <w:r>
-        <w:rPr>
-          <w:b/>
-          <w:bCs/>
-          <w:color w:val="D86DCB" w:themeColor="accent5" w:themeTint="99"/>
-          <w:sz w:val="32"/>
-          <w:szCs w:val="32"/>
-        </w:rPr>
-        <w:t>()</w:t>
-      </w:r>
-    </w:p>
-    <w:p>
-      <w:pPr>
-        <w:jc w:val="both"/>
-        <w:rPr>
-          <w:sz w:val="32"/>
-          <w:szCs w:val="32"/>
-        </w:rPr>
-      </w:pPr>
-      <w:r>
-        <w:rPr>
-          <w:sz w:val="32"/>
-          <w:szCs w:val="32"/>
-        </w:rPr>
-        <w:t xml:space="preserve"># </w:t>
-      </w:r>
-      <w:r>
-        <w:rPr>
-          <w:sz w:val="32"/>
-          <w:szCs w:val="32"/>
-        </w:rPr>
-        <w:t>Use it when the method doesn't use any instance or class data.</w:t>
-      </w:r>
-    </w:p>
-    <w:p>
-      <w:pPr>
-        <w:jc w:val="both"/>
-        <w:rPr>
-          <w:sz w:val="32"/>
-          <w:szCs w:val="32"/>
-        </w:rPr>
-      </w:pPr>
-    </w:p>
-    <w:p>
-      <w:pPr>
-        <w:jc w:val="center"/>
-        <w:rPr>
-          <w:sz w:val="32"/>
-          <w:szCs w:val="32"/>
-        </w:rPr>
-      </w:pPr>
-      <w:r>
-        <w:rPr>
-          <w:sz w:val="32"/>
-          <w:szCs w:val="32"/>
-        </w:rPr>
-        <w:t>Break</w:t>
-      </w:r>
-    </w:p>
-    <w:p>
-      <w:pPr>
-        <w:jc w:val="both"/>
-        <w:rPr>
-          <w:sz w:val="32"/>
-          <w:szCs w:val="32"/>
-        </w:rPr>
-      </w:pPr>
-    </w:p>
-    <w:p>
-      <w:pPr>
-        <w:jc w:val="both"/>
-        <w:rPr>
-          <w:sz w:val="32"/>
-          <w:szCs w:val="32"/>
-        </w:rPr>
-      </w:pPr>
-      <w:r>
-        <w:rPr>
-          <w:b/>
-          <w:bCs/>
-          <w:sz w:val="32"/>
-          <w:szCs w:val="32"/>
-        </w:rPr>
-        <w:t>Inheritance:</w:t>
-      </w:r>
-    </w:p>
-    <w:p>
-      <w:pPr>
-        <w:jc w:val="both"/>
-        <w:rPr>
-          <w:sz w:val="32"/>
-          <w:szCs w:val="32"/>
-        </w:rPr>
-      </w:pPr>
-      <w:r>
-        <w:rPr>
-          <w:sz w:val="32"/>
-          <w:szCs w:val="32"/>
-        </w:rPr>
-        <w:t># We can inherit a class just by-passing parent class (</w:t>
-      </w:r>
-      <w:r>
-        <w:rPr>
-          <w:b/>
-          <w:bCs/>
-          <w:sz w:val="32"/>
-          <w:szCs w:val="32"/>
-        </w:rPr>
-        <w:t>Animal</w:t>
-      </w:r>
-      <w:r>
-        <w:rPr>
-          <w:sz w:val="32"/>
-          <w:szCs w:val="32"/>
-        </w:rPr>
-        <w:t>) to the child class (</w:t>
-      </w:r>
-      <w:r>
-        <w:rPr>
-          <w:b/>
-          <w:bCs/>
-          <w:sz w:val="32"/>
-          <w:szCs w:val="32"/>
-        </w:rPr>
-        <w:t>Dog</w:t>
-      </w:r>
-      <w:r>
-        <w:rPr>
-          <w:sz w:val="32"/>
-          <w:szCs w:val="32"/>
-        </w:rPr>
-        <w:t>) in parentheses</w:t>
-      </w:r>
-      <w:r>
-        <w:rPr>
-          <w:b/>
-          <w:bCs/>
-          <w:sz w:val="32"/>
-          <w:szCs w:val="32"/>
-        </w:rPr>
-        <w:t xml:space="preserve"> ()</w:t>
-      </w:r>
-      <w:r>
-        <w:rPr>
-          <w:sz w:val="32"/>
-          <w:szCs w:val="32"/>
-        </w:rPr>
-        <w:t xml:space="preserve"> when creating the child class.</w:t>
-      </w:r>
-    </w:p>
-    <w:p>
-      <w:pPr>
-        <w:jc w:val="both"/>
-        <w:rPr>
-          <w:b/>
-          <w:bCs/>
-          <w:sz w:val="32"/>
-          <w:szCs w:val="32"/>
-        </w:rPr>
-      </w:pPr>
-      <w:r>
-        <w:rPr>
-          <w:sz w:val="32"/>
-          <w:szCs w:val="32"/>
-        </w:rPr>
-        <w:t xml:space="preserve"># </w:t>
-      </w:r>
-      <w:r>
-        <w:rPr>
-          <w:sz w:val="32"/>
-          <w:szCs w:val="32"/>
-        </w:rPr>
-        <w:t xml:space="preserve">Child class </w:t>
-      </w:r>
-      <w:r>
-        <w:rPr>
-          <w:b/>
-          <w:bCs/>
-          <w:sz w:val="32"/>
-          <w:szCs w:val="32"/>
-        </w:rPr>
-        <w:t>Dog</w:t>
-      </w:r>
-      <w:r>
-        <w:rPr>
-          <w:sz w:val="32"/>
-          <w:szCs w:val="32"/>
-        </w:rPr>
-        <w:t xml:space="preserve"> will inherit all the things like properties and methods of the parent class </w:t>
-      </w:r>
-      <w:r>
-        <w:rPr>
-          <w:b/>
-          <w:bCs/>
-          <w:sz w:val="32"/>
-          <w:szCs w:val="32"/>
-        </w:rPr>
-        <w:t>Animal</w:t>
-      </w:r>
-    </w:p>
-    <w:p>
-      <w:pPr>
-        <w:jc w:val="both"/>
-        <w:rPr>
-          <w:b/>
-          <w:bCs/>
-          <w:color w:val="D86DCB" w:themeColor="accent5" w:themeTint="99"/>
-          <w:sz w:val="32"/>
-          <w:szCs w:val="32"/>
-        </w:rPr>
-      </w:pPr>
-      <w:r>
-        <w:rPr>
-          <w:b/>
-          <w:bCs/>
-          <w:color w:val="D86DCB" w:themeColor="accent5" w:themeTint="99"/>
-          <w:sz w:val="32"/>
-          <w:szCs w:val="32"/>
-        </w:rPr>
         <w:t>class Animal:</w:t>
       </w:r>
     </w:p>
@@ -9187,7 +9850,6 @@
           <w:sz w:val="32"/>
           <w:szCs w:val="32"/>
         </w:rPr>
-        <w:lastRenderedPageBreak/>
         <w:t>duck.swim</w:t>
       </w:r>
       <w:proofErr w:type="spellEnd"/>
@@ -9479,6 +10141,7 @@
           <w:sz w:val="32"/>
           <w:szCs w:val="32"/>
         </w:rPr>
+        <w:lastRenderedPageBreak/>
         <w:t>Properties (</w:t>
       </w:r>
       <w:r>
@@ -10250,6 +10913,7 @@
           <w:sz w:val="32"/>
           <w:szCs w:val="32"/>
         </w:rPr>
+        <w:lastRenderedPageBreak/>
         <w:t>student.greeting</w:t>
       </w:r>
       <w:proofErr w:type="spellEnd"/>
@@ -10619,182 +11283,12 @@
         </w:rPr>
         <w:t xml:space="preserve"> function we have to edit them using dot</w:t>
       </w:r>
-    </w:p>
-    <w:p>
-      <w:pPr>
-        <w:jc w:val="both"/>
-        <w:rPr>
-          <w:b/>
-          <w:bCs/>
-          <w:color w:val="D86DCB" w:themeColor="accent5" w:themeTint="99"/>
-          <w:sz w:val="32"/>
-          <w:szCs w:val="32"/>
-        </w:rPr>
-      </w:pPr>
-      <w:r>
-        <w:rPr>
-          <w:b/>
-          <w:bCs/>
-          <w:color w:val="D86DCB" w:themeColor="accent5" w:themeTint="99"/>
-          <w:sz w:val="32"/>
-          <w:szCs w:val="32"/>
-        </w:rPr>
-        <w:t xml:space="preserve">class </w:t>
-      </w:r>
-      <w:proofErr w:type="spellStart"/>
-      <w:r>
-        <w:rPr>
-          <w:b/>
-          <w:bCs/>
-          <w:color w:val="D86DCB" w:themeColor="accent5" w:themeTint="99"/>
-          <w:sz w:val="32"/>
-          <w:szCs w:val="32"/>
-        </w:rPr>
-        <w:t>Vechile</w:t>
-      </w:r>
-      <w:proofErr w:type="spellEnd"/>
-      <w:r>
-        <w:rPr>
-          <w:b/>
-          <w:bCs/>
-          <w:color w:val="D86DCB" w:themeColor="accent5" w:themeTint="99"/>
-          <w:sz w:val="32"/>
-          <w:szCs w:val="32"/>
-        </w:rPr>
-        <w:t>:</w:t>
-      </w:r>
-    </w:p>
-    <w:p>
-      <w:pPr>
-        <w:jc w:val="both"/>
-        <w:rPr>
-          <w:b/>
-          <w:bCs/>
-          <w:color w:val="D86DCB" w:themeColor="accent5" w:themeTint="99"/>
-          <w:sz w:val="32"/>
-          <w:szCs w:val="32"/>
-        </w:rPr>
-      </w:pPr>
-      <w:r>
-        <w:rPr>
-          <w:b/>
-          <w:bCs/>
-          <w:color w:val="D86DCB" w:themeColor="accent5" w:themeTint="99"/>
-          <w:sz w:val="32"/>
-          <w:szCs w:val="32"/>
-        </w:rPr>
-        <w:t xml:space="preserve">    def __</w:t>
-      </w:r>
-      <w:proofErr w:type="spellStart"/>
-      <w:r>
-        <w:rPr>
-          <w:b/>
-          <w:bCs/>
-          <w:color w:val="D86DCB" w:themeColor="accent5" w:themeTint="99"/>
-          <w:sz w:val="32"/>
-          <w:szCs w:val="32"/>
-        </w:rPr>
-        <w:t>init</w:t>
-      </w:r>
-      <w:proofErr w:type="spellEnd"/>
-      <w:r>
-        <w:rPr>
-          <w:b/>
-          <w:bCs/>
-          <w:color w:val="D86DCB" w:themeColor="accent5" w:themeTint="99"/>
-          <w:sz w:val="32"/>
-          <w:szCs w:val="32"/>
-        </w:rPr>
-        <w:t>_</w:t>
-      </w:r>
-      <w:proofErr w:type="gramStart"/>
-      <w:r>
-        <w:rPr>
-          <w:b/>
-          <w:bCs/>
-          <w:color w:val="D86DCB" w:themeColor="accent5" w:themeTint="99"/>
-          <w:sz w:val="32"/>
-          <w:szCs w:val="32"/>
-        </w:rPr>
-        <w:t>_(</w:t>
-      </w:r>
-      <w:proofErr w:type="gramEnd"/>
-      <w:r>
-        <w:rPr>
-          <w:b/>
-          <w:bCs/>
-          <w:color w:val="D86DCB" w:themeColor="accent5" w:themeTint="99"/>
-          <w:sz w:val="32"/>
-          <w:szCs w:val="32"/>
-        </w:rPr>
-        <w:t xml:space="preserve">self, </w:t>
-      </w:r>
-      <w:proofErr w:type="spellStart"/>
-      <w:r>
-        <w:rPr>
-          <w:b/>
-          <w:bCs/>
-          <w:color w:val="D86DCB" w:themeColor="accent5" w:themeTint="99"/>
-          <w:sz w:val="32"/>
-          <w:szCs w:val="32"/>
-        </w:rPr>
-        <w:t>name,type</w:t>
-      </w:r>
-      <w:proofErr w:type="spellEnd"/>
-      <w:r>
-        <w:rPr>
-          <w:b/>
-          <w:bCs/>
-          <w:color w:val="D86DCB" w:themeColor="accent5" w:themeTint="99"/>
-          <w:sz w:val="32"/>
-          <w:szCs w:val="32"/>
-        </w:rPr>
-        <w:t>, brand):</w:t>
-      </w:r>
-    </w:p>
-    <w:p>
-      <w:pPr>
-        <w:jc w:val="both"/>
-        <w:rPr>
-          <w:b/>
-          <w:bCs/>
-          <w:color w:val="D86DCB" w:themeColor="accent5" w:themeTint="99"/>
-          <w:sz w:val="32"/>
-          <w:szCs w:val="32"/>
-        </w:rPr>
-      </w:pPr>
-      <w:r>
-        <w:rPr>
-          <w:b/>
-          <w:bCs/>
-          <w:color w:val="D86DCB" w:themeColor="accent5" w:themeTint="99"/>
-          <w:sz w:val="32"/>
-          <w:szCs w:val="32"/>
-        </w:rPr>
-        <w:t xml:space="preserve">        self.name = name</w:t>
-      </w:r>
-    </w:p>
-    <w:p>
-      <w:pPr>
-        <w:jc w:val="both"/>
-        <w:rPr>
-          <w:b/>
-          <w:bCs/>
-          <w:color w:val="D86DCB" w:themeColor="accent5" w:themeTint="99"/>
-          <w:sz w:val="32"/>
-          <w:szCs w:val="32"/>
-        </w:rPr>
-      </w:pPr>
-      <w:r>
-        <w:rPr>
-          <w:b/>
-          <w:bCs/>
-          <w:color w:val="D86DCB" w:themeColor="accent5" w:themeTint="99"/>
-          <w:sz w:val="32"/>
-          <w:szCs w:val="32"/>
-        </w:rPr>
-        <w:lastRenderedPageBreak/>
-        <w:t xml:space="preserve">        </w:t>
+      <w:r>
+        <w:rPr>
+          <w:sz w:val="32"/>
+          <w:szCs w:val="32"/>
+        </w:rPr>
+        <w:t xml:space="preserve">. Also this is noticeable in </w:t>
       </w:r>
       <w:proofErr w:type="spellStart"/>
       <w:proofErr w:type="gramStart"/>
@@ -10802,6 +11296,229 @@
         <w:rPr>
           <w:b/>
           <w:bCs/>
+          <w:sz w:val="32"/>
+          <w:szCs w:val="32"/>
+        </w:rPr>
+        <w:t>initState</w:t>
+      </w:r>
+      <w:proofErr w:type="spellEnd"/>
+      <w:r>
+        <w:rPr>
+          <w:b/>
+          <w:bCs/>
+          <w:sz w:val="32"/>
+          <w:szCs w:val="32"/>
+        </w:rPr>
+        <w:t>(</w:t>
+      </w:r>
+      <w:proofErr w:type="gramEnd"/>
+      <w:r>
+        <w:rPr>
+          <w:b/>
+          <w:bCs/>
+          <w:sz w:val="32"/>
+          <w:szCs w:val="32"/>
+        </w:rPr>
+        <w:t>)</w:t>
+      </w:r>
+      <w:r>
+        <w:rPr>
+          <w:sz w:val="32"/>
+          <w:szCs w:val="32"/>
+        </w:rPr>
+        <w:t xml:space="preserve"> of</w:t>
+      </w:r>
+      <w:r>
+        <w:rPr>
+          <w:b/>
+          <w:bCs/>
+          <w:sz w:val="32"/>
+          <w:szCs w:val="32"/>
+        </w:rPr>
+        <w:t xml:space="preserve"> Flutter</w:t>
+      </w:r>
+    </w:p>
+    <w:p>
+      <w:pPr>
+        <w:jc w:val="both"/>
+        <w:rPr>
+          <w:b/>
+          <w:bCs/>
+          <w:color w:val="D86DCB" w:themeColor="accent5" w:themeTint="99"/>
+          <w:sz w:val="32"/>
+          <w:szCs w:val="32"/>
+        </w:rPr>
+      </w:pPr>
+      <w:r>
+        <w:rPr>
+          <w:b/>
+          <w:bCs/>
+          <w:color w:val="D86DCB" w:themeColor="accent5" w:themeTint="99"/>
+          <w:sz w:val="32"/>
+          <w:szCs w:val="32"/>
+        </w:rPr>
+        <w:t xml:space="preserve">class </w:t>
+      </w:r>
+      <w:proofErr w:type="spellStart"/>
+      <w:r>
+        <w:rPr>
+          <w:b/>
+          <w:bCs/>
+          <w:color w:val="D86DCB" w:themeColor="accent5" w:themeTint="99"/>
+          <w:sz w:val="32"/>
+          <w:szCs w:val="32"/>
+        </w:rPr>
+        <w:t>Vechile</w:t>
+      </w:r>
+      <w:proofErr w:type="spellEnd"/>
+      <w:r>
+        <w:rPr>
+          <w:b/>
+          <w:bCs/>
+          <w:color w:val="D86DCB" w:themeColor="accent5" w:themeTint="99"/>
+          <w:sz w:val="32"/>
+          <w:szCs w:val="32"/>
+        </w:rPr>
+        <w:t>:</w:t>
+      </w:r>
+    </w:p>
+    <w:p>
+      <w:pPr>
+        <w:jc w:val="both"/>
+        <w:rPr>
+          <w:b/>
+          <w:bCs/>
+          <w:color w:val="D86DCB" w:themeColor="accent5" w:themeTint="99"/>
+          <w:sz w:val="32"/>
+          <w:szCs w:val="32"/>
+        </w:rPr>
+      </w:pPr>
+      <w:r>
+        <w:rPr>
+          <w:b/>
+          <w:bCs/>
+          <w:color w:val="D86DCB" w:themeColor="accent5" w:themeTint="99"/>
+          <w:sz w:val="32"/>
+          <w:szCs w:val="32"/>
+        </w:rPr>
+        <w:t xml:space="preserve">    def __</w:t>
+      </w:r>
+      <w:proofErr w:type="spellStart"/>
+      <w:r>
+        <w:rPr>
+          <w:b/>
+          <w:bCs/>
+          <w:color w:val="D86DCB" w:themeColor="accent5" w:themeTint="99"/>
+          <w:sz w:val="32"/>
+          <w:szCs w:val="32"/>
+        </w:rPr>
+        <w:t>init</w:t>
+      </w:r>
+      <w:proofErr w:type="spellEnd"/>
+      <w:r>
+        <w:rPr>
+          <w:b/>
+          <w:bCs/>
+          <w:color w:val="D86DCB" w:themeColor="accent5" w:themeTint="99"/>
+          <w:sz w:val="32"/>
+          <w:szCs w:val="32"/>
+        </w:rPr>
+        <w:t>_</w:t>
+      </w:r>
+      <w:proofErr w:type="gramStart"/>
+      <w:r>
+        <w:rPr>
+          <w:b/>
+          <w:bCs/>
+          <w:color w:val="D86DCB" w:themeColor="accent5" w:themeTint="99"/>
+          <w:sz w:val="32"/>
+          <w:szCs w:val="32"/>
+        </w:rPr>
+        <w:t>_(</w:t>
+      </w:r>
+      <w:proofErr w:type="gramEnd"/>
+      <w:r>
+        <w:rPr>
+          <w:b/>
+          <w:bCs/>
+          <w:color w:val="D86DCB" w:themeColor="accent5" w:themeTint="99"/>
+          <w:sz w:val="32"/>
+          <w:szCs w:val="32"/>
+        </w:rPr>
+        <w:t xml:space="preserve">self, </w:t>
+      </w:r>
+      <w:proofErr w:type="spellStart"/>
+      <w:r>
+        <w:rPr>
+          <w:b/>
+          <w:bCs/>
+          <w:color w:val="D86DCB" w:themeColor="accent5" w:themeTint="99"/>
+          <w:sz w:val="32"/>
+          <w:szCs w:val="32"/>
+        </w:rPr>
+        <w:t>name,type</w:t>
+      </w:r>
+      <w:proofErr w:type="spellEnd"/>
+      <w:r>
+        <w:rPr>
+          <w:b/>
+          <w:bCs/>
+          <w:color w:val="D86DCB" w:themeColor="accent5" w:themeTint="99"/>
+          <w:sz w:val="32"/>
+          <w:szCs w:val="32"/>
+        </w:rPr>
+        <w:t>, brand):</w:t>
+      </w:r>
+    </w:p>
+    <w:p>
+      <w:pPr>
+        <w:jc w:val="both"/>
+        <w:rPr>
+          <w:b/>
+          <w:bCs/>
+          <w:color w:val="D86DCB" w:themeColor="accent5" w:themeTint="99"/>
+          <w:sz w:val="32"/>
+          <w:szCs w:val="32"/>
+        </w:rPr>
+      </w:pPr>
+      <w:r>
+        <w:rPr>
+          <w:b/>
+          <w:bCs/>
+          <w:color w:val="D86DCB" w:themeColor="accent5" w:themeTint="99"/>
+          <w:sz w:val="32"/>
+          <w:szCs w:val="32"/>
+        </w:rPr>
+        <w:t xml:space="preserve">        self.name = name</w:t>
+      </w:r>
+    </w:p>
+    <w:p>
+      <w:pPr>
+        <w:jc w:val="both"/>
+        <w:rPr>
+          <w:b/>
+          <w:bCs/>
+          <w:color w:val="D86DCB" w:themeColor="accent5" w:themeTint="99"/>
+          <w:sz w:val="32"/>
+          <w:szCs w:val="32"/>
+        </w:rPr>
+      </w:pPr>
+      <w:r>
+        <w:rPr>
+          <w:b/>
+          <w:bCs/>
+          <w:color w:val="D86DCB" w:themeColor="accent5" w:themeTint="99"/>
+          <w:sz w:val="32"/>
+          <w:szCs w:val="32"/>
+        </w:rPr>
+        <w:t xml:space="preserve">        </w:t>
+      </w:r>
+      <w:proofErr w:type="spellStart"/>
+      <w:proofErr w:type="gramStart"/>
+      <w:r>
+        <w:rPr>
+          <w:b/>
+          <w:bCs/>
           <w:color w:val="D86DCB" w:themeColor="accent5" w:themeTint="99"/>
           <w:sz w:val="32"/>
           <w:szCs w:val="32"/>
@@ -11267,6 +11984,7 @@
           <w:sz w:val="32"/>
           <w:szCs w:val="32"/>
         </w:rPr>
+        <w:lastRenderedPageBreak/>
         <w:t>print(</w:t>
       </w:r>
       <w:proofErr w:type="spellStart"/>
@@ -11634,7 +12352,6 @@
           <w:sz w:val="28"/>
           <w:szCs w:val="28"/>
         </w:rPr>
-        <w:lastRenderedPageBreak/>
         <w:t>balance</w:t>
       </w:r>
     </w:p>
@@ -11826,6 +12543,7 @@
           <w:sz w:val="32"/>
           <w:szCs w:val="32"/>
         </w:rPr>
+        <w:lastRenderedPageBreak/>
         <w:t xml:space="preserve"># </w:t>
       </w:r>
       <w:r>
@@ -12398,7 +13116,6 @@
           <w:sz w:val="32"/>
           <w:szCs w:val="32"/>
         </w:rPr>
-        <w:lastRenderedPageBreak/>
         <w:t>print(s.name) # Nazmul</w:t>
       </w:r>
     </w:p>
@@ -12440,7 +13157,21 @@
           <w:sz w:val="32"/>
           <w:szCs w:val="32"/>
         </w:rPr>
-        <w:t># Single underscore which tells other developers “Please don’t access this outside the class unless you have</w:t>
+        <w:t># Single underscore</w:t>
+      </w:r>
+      <w:r>
+        <w:rPr>
+          <w:sz w:val="32"/>
+          <w:szCs w:val="32"/>
+        </w:rPr>
+        <w:t xml:space="preserve"> (_)</w:t>
+      </w:r>
+      <w:r>
+        <w:rPr>
+          <w:sz w:val="32"/>
+          <w:szCs w:val="32"/>
+        </w:rPr>
+        <w:t xml:space="preserve"> which tells other developers “Please don’t access this outside the class unless you have</w:t>
       </w:r>
       <w:r>
         <w:rPr>
@@ -12591,6 +13322,7 @@
           <w:sz w:val="32"/>
           <w:szCs w:val="32"/>
         </w:rPr>
+        <w:lastRenderedPageBreak/>
         <w:t>print(</w:t>
       </w:r>
       <w:proofErr w:type="spellStart"/>
@@ -12986,7 +13718,6 @@
           <w:sz w:val="32"/>
           <w:szCs w:val="32"/>
         </w:rPr>
-        <w:lastRenderedPageBreak/>
         <w:t xml:space="preserve"># </w:t>
       </w:r>
       <w:r>
@@ -13271,6 +14002,7 @@
           <w:sz w:val="32"/>
           <w:szCs w:val="32"/>
         </w:rPr>
+        <w:lastRenderedPageBreak/>
         <w:t xml:space="preserve">    def balance(self):</w:t>
       </w:r>
     </w:p>
@@ -14013,6 +14745,7 @@
           <w:sz w:val="32"/>
           <w:szCs w:val="32"/>
         </w:rPr>
+        <w:lastRenderedPageBreak/>
         <w:t>check_</w:t>
       </w:r>
       <w:proofErr w:type="gramStart"/>
@@ -14577,213 +15310,213 @@
           <w:sz w:val="32"/>
           <w:szCs w:val="32"/>
         </w:rPr>
+        <w:t>Polymorphism:</w:t>
+      </w:r>
+    </w:p>
+    <w:p>
+      <w:pPr>
+        <w:jc w:val="both"/>
+        <w:rPr>
+          <w:sz w:val="32"/>
+          <w:szCs w:val="32"/>
+        </w:rPr>
+      </w:pPr>
+      <w:r>
+        <w:rPr>
+          <w:sz w:val="32"/>
+          <w:szCs w:val="32"/>
+        </w:rPr>
+        <w:t xml:space="preserve"># </w:t>
+      </w:r>
+      <w:r>
+        <w:rPr>
+          <w:sz w:val="32"/>
+          <w:szCs w:val="32"/>
+        </w:rPr>
+        <w:t xml:space="preserve">Changing something from the </w:t>
+      </w:r>
+      <w:r>
+        <w:rPr>
+          <w:sz w:val="32"/>
+          <w:szCs w:val="32"/>
+        </w:rPr>
+        <w:t>P</w:t>
+      </w:r>
+      <w:r>
+        <w:rPr>
+          <w:sz w:val="32"/>
+          <w:szCs w:val="32"/>
+        </w:rPr>
+        <w:t xml:space="preserve">arent class in </w:t>
+      </w:r>
+      <w:r>
+        <w:rPr>
+          <w:sz w:val="32"/>
+          <w:szCs w:val="32"/>
+        </w:rPr>
+        <w:t>C</w:t>
+      </w:r>
+      <w:r>
+        <w:rPr>
+          <w:sz w:val="32"/>
+          <w:szCs w:val="32"/>
+        </w:rPr>
+        <w:t xml:space="preserve">hild class is called </w:t>
+      </w:r>
+      <w:r>
+        <w:rPr>
+          <w:sz w:val="32"/>
+          <w:szCs w:val="32"/>
+        </w:rPr>
+        <w:t>P</w:t>
+      </w:r>
+      <w:r>
+        <w:rPr>
+          <w:sz w:val="32"/>
+          <w:szCs w:val="32"/>
+        </w:rPr>
+        <w:t>olymorphism.</w:t>
+      </w:r>
+    </w:p>
+    <w:p>
+      <w:pPr>
+        <w:jc w:val="both"/>
+        <w:rPr>
+          <w:sz w:val="32"/>
+          <w:szCs w:val="32"/>
+        </w:rPr>
+      </w:pPr>
+      <w:r>
+        <w:rPr>
+          <w:sz w:val="32"/>
+          <w:szCs w:val="32"/>
+        </w:rPr>
+        <w:t># Different objects respond to the same method call in different ways. Like same method (</w:t>
+      </w:r>
+      <w:proofErr w:type="gramStart"/>
+      <w:r>
+        <w:rPr>
+          <w:b/>
+          <w:bCs/>
+          <w:sz w:val="32"/>
+          <w:szCs w:val="32"/>
+        </w:rPr>
+        <w:t>speak(</w:t>
+      </w:r>
+      <w:proofErr w:type="gramEnd"/>
+      <w:r>
+        <w:rPr>
+          <w:b/>
+          <w:bCs/>
+          <w:sz w:val="32"/>
+          <w:szCs w:val="32"/>
+        </w:rPr>
+        <w:t>)</w:t>
+      </w:r>
+      <w:r>
+        <w:rPr>
+          <w:sz w:val="32"/>
+          <w:szCs w:val="32"/>
+        </w:rPr>
+        <w:t>), different behavior. We can do this by overriding method</w:t>
+      </w:r>
+    </w:p>
+    <w:p>
+      <w:pPr>
+        <w:jc w:val="both"/>
+        <w:rPr>
+          <w:sz w:val="32"/>
+          <w:szCs w:val="32"/>
+        </w:rPr>
+      </w:pPr>
+      <w:r>
+        <w:rPr>
+          <w:sz w:val="32"/>
+          <w:szCs w:val="32"/>
+        </w:rPr>
+        <w:t># Overriding means a Child class provides its own implementation of Parent class method and also use</w:t>
+      </w:r>
+      <w:r>
+        <w:rPr>
+          <w:b/>
+          <w:bCs/>
+          <w:sz w:val="32"/>
+          <w:szCs w:val="32"/>
+        </w:rPr>
+        <w:t xml:space="preserve"> from typing import override</w:t>
+      </w:r>
+      <w:r>
+        <w:rPr>
+          <w:sz w:val="32"/>
+          <w:szCs w:val="32"/>
+        </w:rPr>
+        <w:t xml:space="preserve"> library for better code readability (but optional)</w:t>
+      </w:r>
+    </w:p>
+    <w:p>
+      <w:pPr>
+        <w:jc w:val="both"/>
+        <w:rPr>
+          <w:b/>
+          <w:bCs/>
+          <w:color w:val="D86DCB" w:themeColor="accent5" w:themeTint="99"/>
+          <w:sz w:val="32"/>
+          <w:szCs w:val="32"/>
+        </w:rPr>
+      </w:pPr>
+      <w:r>
+        <w:rPr>
+          <w:b/>
+          <w:bCs/>
+          <w:color w:val="D86DCB" w:themeColor="accent5" w:themeTint="99"/>
+          <w:sz w:val="32"/>
+          <w:szCs w:val="32"/>
+        </w:rPr>
+        <w:t>from typing import override</w:t>
+      </w:r>
+    </w:p>
+    <w:p>
+      <w:pPr>
+        <w:jc w:val="both"/>
+        <w:rPr>
+          <w:b/>
+          <w:bCs/>
+          <w:color w:val="D86DCB" w:themeColor="accent5" w:themeTint="99"/>
+          <w:sz w:val="32"/>
+          <w:szCs w:val="32"/>
+        </w:rPr>
+      </w:pPr>
+      <w:r>
+        <w:rPr>
+          <w:b/>
+          <w:bCs/>
+          <w:color w:val="D86DCB" w:themeColor="accent5" w:themeTint="99"/>
+          <w:sz w:val="32"/>
+          <w:szCs w:val="32"/>
+        </w:rPr>
+        <w:t>class Animal:</w:t>
+      </w:r>
+    </w:p>
+    <w:p>
+      <w:pPr>
+        <w:jc w:val="both"/>
+        <w:rPr>
+          <w:b/>
+          <w:bCs/>
+          <w:color w:val="D86DCB" w:themeColor="accent5" w:themeTint="99"/>
+          <w:sz w:val="32"/>
+          <w:szCs w:val="32"/>
+        </w:rPr>
+      </w:pPr>
+      <w:r>
+        <w:rPr>
+          <w:b/>
+          <w:bCs/>
+          <w:color w:val="D86DCB" w:themeColor="accent5" w:themeTint="99"/>
+          <w:sz w:val="32"/>
+          <w:szCs w:val="32"/>
+        </w:rPr>
         <w:lastRenderedPageBreak/>
-        <w:t>Polymorphism:</w:t>
-      </w:r>
-    </w:p>
-    <w:p>
-      <w:pPr>
-        <w:jc w:val="both"/>
-        <w:rPr>
-          <w:sz w:val="32"/>
-          <w:szCs w:val="32"/>
-        </w:rPr>
-      </w:pPr>
-      <w:r>
-        <w:rPr>
-          <w:sz w:val="32"/>
-          <w:szCs w:val="32"/>
-        </w:rPr>
-        <w:t xml:space="preserve"># </w:t>
-      </w:r>
-      <w:r>
-        <w:rPr>
-          <w:sz w:val="32"/>
-          <w:szCs w:val="32"/>
-        </w:rPr>
-        <w:t xml:space="preserve">Changing something from the </w:t>
-      </w:r>
-      <w:r>
-        <w:rPr>
-          <w:sz w:val="32"/>
-          <w:szCs w:val="32"/>
-        </w:rPr>
-        <w:t>P</w:t>
-      </w:r>
-      <w:r>
-        <w:rPr>
-          <w:sz w:val="32"/>
-          <w:szCs w:val="32"/>
-        </w:rPr>
-        <w:t xml:space="preserve">arent class in </w:t>
-      </w:r>
-      <w:r>
-        <w:rPr>
-          <w:sz w:val="32"/>
-          <w:szCs w:val="32"/>
-        </w:rPr>
-        <w:t>C</w:t>
-      </w:r>
-      <w:r>
-        <w:rPr>
-          <w:sz w:val="32"/>
-          <w:szCs w:val="32"/>
-        </w:rPr>
-        <w:t xml:space="preserve">hild class is called </w:t>
-      </w:r>
-      <w:r>
-        <w:rPr>
-          <w:sz w:val="32"/>
-          <w:szCs w:val="32"/>
-        </w:rPr>
-        <w:t>P</w:t>
-      </w:r>
-      <w:r>
-        <w:rPr>
-          <w:sz w:val="32"/>
-          <w:szCs w:val="32"/>
-        </w:rPr>
-        <w:t>olymorphism.</w:t>
-      </w:r>
-    </w:p>
-    <w:p>
-      <w:pPr>
-        <w:jc w:val="both"/>
-        <w:rPr>
-          <w:sz w:val="32"/>
-          <w:szCs w:val="32"/>
-        </w:rPr>
-      </w:pPr>
-      <w:r>
-        <w:rPr>
-          <w:sz w:val="32"/>
-          <w:szCs w:val="32"/>
-        </w:rPr>
-        <w:t># Different objects respond to the same method call in different ways. Like same method (</w:t>
-      </w:r>
-      <w:proofErr w:type="gramStart"/>
-      <w:r>
-        <w:rPr>
-          <w:b/>
-          <w:bCs/>
-          <w:sz w:val="32"/>
-          <w:szCs w:val="32"/>
-        </w:rPr>
-        <w:t>speak(</w:t>
-      </w:r>
-      <w:proofErr w:type="gramEnd"/>
-      <w:r>
-        <w:rPr>
-          <w:b/>
-          <w:bCs/>
-          <w:sz w:val="32"/>
-          <w:szCs w:val="32"/>
-        </w:rPr>
-        <w:t>)</w:t>
-      </w:r>
-      <w:r>
-        <w:rPr>
-          <w:sz w:val="32"/>
-          <w:szCs w:val="32"/>
-        </w:rPr>
-        <w:t>), different behavior. We can do this by overriding method</w:t>
-      </w:r>
-    </w:p>
-    <w:p>
-      <w:pPr>
-        <w:jc w:val="both"/>
-        <w:rPr>
-          <w:sz w:val="32"/>
-          <w:szCs w:val="32"/>
-        </w:rPr>
-      </w:pPr>
-      <w:r>
-        <w:rPr>
-          <w:sz w:val="32"/>
-          <w:szCs w:val="32"/>
-        </w:rPr>
-        <w:t># Overriding means a Child class provides its own implementation of Parent class method and also use</w:t>
-      </w:r>
-      <w:r>
-        <w:rPr>
-          <w:b/>
-          <w:bCs/>
-          <w:sz w:val="32"/>
-          <w:szCs w:val="32"/>
-        </w:rPr>
-        <w:t xml:space="preserve"> from typing import override</w:t>
-      </w:r>
-      <w:r>
-        <w:rPr>
-          <w:sz w:val="32"/>
-          <w:szCs w:val="32"/>
-        </w:rPr>
-        <w:t xml:space="preserve"> library for better code readability (but optional)</w:t>
-      </w:r>
-    </w:p>
-    <w:p>
-      <w:pPr>
-        <w:jc w:val="both"/>
-        <w:rPr>
-          <w:b/>
-          <w:bCs/>
-          <w:color w:val="D86DCB" w:themeColor="accent5" w:themeTint="99"/>
-          <w:sz w:val="32"/>
-          <w:szCs w:val="32"/>
-        </w:rPr>
-      </w:pPr>
-      <w:r>
-        <w:rPr>
-          <w:b/>
-          <w:bCs/>
-          <w:color w:val="D86DCB" w:themeColor="accent5" w:themeTint="99"/>
-          <w:sz w:val="32"/>
-          <w:szCs w:val="32"/>
-        </w:rPr>
-        <w:t>from typing import override</w:t>
-      </w:r>
-    </w:p>
-    <w:p>
-      <w:pPr>
-        <w:jc w:val="both"/>
-        <w:rPr>
-          <w:b/>
-          <w:bCs/>
-          <w:color w:val="D86DCB" w:themeColor="accent5" w:themeTint="99"/>
-          <w:sz w:val="32"/>
-          <w:szCs w:val="32"/>
-        </w:rPr>
-      </w:pPr>
-      <w:r>
-        <w:rPr>
-          <w:b/>
-          <w:bCs/>
-          <w:color w:val="D86DCB" w:themeColor="accent5" w:themeTint="99"/>
-          <w:sz w:val="32"/>
-          <w:szCs w:val="32"/>
-        </w:rPr>
-        <w:t>class Animal:</w:t>
-      </w:r>
-    </w:p>
-    <w:p>
-      <w:pPr>
-        <w:jc w:val="both"/>
-        <w:rPr>
-          <w:b/>
-          <w:bCs/>
-          <w:color w:val="D86DCB" w:themeColor="accent5" w:themeTint="99"/>
-          <w:sz w:val="32"/>
-          <w:szCs w:val="32"/>
-        </w:rPr>
-      </w:pPr>
-      <w:r>
-        <w:rPr>
-          <w:b/>
-          <w:bCs/>
-          <w:color w:val="D86DCB" w:themeColor="accent5" w:themeTint="99"/>
-          <w:sz w:val="32"/>
-          <w:szCs w:val="32"/>
-        </w:rPr>
         <w:t xml:space="preserve">    def speak(self):</w:t>
       </w:r>
     </w:p>
@@ -15089,7 +15822,6 @@
           <w:sz w:val="32"/>
           <w:szCs w:val="32"/>
         </w:rPr>
-        <w:lastRenderedPageBreak/>
         <w:t># We can also call the Parent method</w:t>
       </w:r>
       <w:r>
@@ -15382,6 +16114,7 @@
           <w:sz w:val="32"/>
           <w:szCs w:val="32"/>
         </w:rPr>
+        <w:lastRenderedPageBreak/>
         <w:t xml:space="preserve">    def speak(self):</w:t>
       </w:r>
     </w:p>
@@ -15645,326 +16378,326 @@
           <w:sz w:val="32"/>
           <w:szCs w:val="32"/>
         </w:rPr>
+        <w:t>Duck Typing:</w:t>
+      </w:r>
+    </w:p>
+    <w:p>
+      <w:pPr>
+        <w:jc w:val="both"/>
+        <w:rPr>
+          <w:sz w:val="32"/>
+          <w:szCs w:val="32"/>
+        </w:rPr>
+      </w:pPr>
+      <w:r>
+        <w:rPr>
+          <w:sz w:val="32"/>
+          <w:szCs w:val="32"/>
+        </w:rPr>
+        <w:t xml:space="preserve"># </w:t>
+      </w:r>
+      <w:r>
+        <w:rPr>
+          <w:sz w:val="32"/>
+          <w:szCs w:val="32"/>
+        </w:rPr>
+        <w:t>This is one of Python's unique philosophies.</w:t>
+      </w:r>
+      <w:r>
+        <w:rPr>
+          <w:sz w:val="32"/>
+          <w:szCs w:val="32"/>
+        </w:rPr>
+        <w:t xml:space="preserve"> </w:t>
+      </w:r>
+      <w:r>
+        <w:rPr>
+          <w:sz w:val="32"/>
+          <w:szCs w:val="32"/>
+        </w:rPr>
+        <w:t>The saying is</w:t>
+      </w:r>
+      <w:r>
+        <w:rPr>
+          <w:sz w:val="32"/>
+          <w:szCs w:val="32"/>
+        </w:rPr>
+        <w:t xml:space="preserve"> </w:t>
+      </w:r>
+      <w:r>
+        <w:rPr>
+          <w:sz w:val="32"/>
+          <w:szCs w:val="32"/>
+        </w:rPr>
+        <w:t>"If it walks like a duck and quacks like a duck, then it's a duck."</w:t>
+      </w:r>
+    </w:p>
+    <w:p>
+      <w:pPr>
+        <w:jc w:val="both"/>
+        <w:rPr>
+          <w:sz w:val="32"/>
+          <w:szCs w:val="32"/>
+        </w:rPr>
+      </w:pPr>
+      <w:r>
+        <w:rPr>
+          <w:sz w:val="32"/>
+          <w:szCs w:val="32"/>
+        </w:rPr>
+        <w:t xml:space="preserve"># </w:t>
+      </w:r>
+      <w:r>
+        <w:rPr>
+          <w:sz w:val="32"/>
+          <w:szCs w:val="32"/>
+        </w:rPr>
+        <w:t>Python doesn't care about the object's type</w:t>
+      </w:r>
+      <w:r>
+        <w:rPr>
+          <w:sz w:val="32"/>
+          <w:szCs w:val="32"/>
+        </w:rPr>
+        <w:t xml:space="preserve"> (</w:t>
+      </w:r>
+      <w:r>
+        <w:rPr>
+          <w:b/>
+          <w:bCs/>
+          <w:sz w:val="32"/>
+          <w:szCs w:val="32"/>
+        </w:rPr>
+        <w:t>Duck</w:t>
+      </w:r>
+      <w:r>
+        <w:rPr>
+          <w:sz w:val="32"/>
+          <w:szCs w:val="32"/>
+        </w:rPr>
+        <w:t xml:space="preserve"> or </w:t>
+      </w:r>
+      <w:r>
+        <w:rPr>
+          <w:b/>
+          <w:bCs/>
+          <w:sz w:val="32"/>
+          <w:szCs w:val="32"/>
+        </w:rPr>
+        <w:t>Person</w:t>
+      </w:r>
+      <w:r>
+        <w:rPr>
+          <w:sz w:val="32"/>
+          <w:szCs w:val="32"/>
+        </w:rPr>
+        <w:t>)</w:t>
+      </w:r>
+      <w:r>
+        <w:rPr>
+          <w:sz w:val="32"/>
+          <w:szCs w:val="32"/>
+        </w:rPr>
+        <w:t>.</w:t>
+      </w:r>
+      <w:r>
+        <w:rPr>
+          <w:sz w:val="32"/>
+          <w:szCs w:val="32"/>
+        </w:rPr>
+        <w:t xml:space="preserve"> </w:t>
+      </w:r>
+      <w:r>
+        <w:rPr>
+          <w:sz w:val="32"/>
+          <w:szCs w:val="32"/>
+        </w:rPr>
+        <w:t>It cares whether the object has the required methods</w:t>
+      </w:r>
+      <w:r>
+        <w:rPr>
+          <w:sz w:val="32"/>
+          <w:szCs w:val="32"/>
+        </w:rPr>
+        <w:t xml:space="preserve"> (</w:t>
+      </w:r>
+      <w:proofErr w:type="gramStart"/>
+      <w:r>
+        <w:rPr>
+          <w:b/>
+          <w:bCs/>
+          <w:sz w:val="32"/>
+          <w:szCs w:val="32"/>
+        </w:rPr>
+        <w:t>speak(</w:t>
+      </w:r>
+      <w:proofErr w:type="gramEnd"/>
+      <w:r>
+        <w:rPr>
+          <w:b/>
+          <w:bCs/>
+          <w:sz w:val="32"/>
+          <w:szCs w:val="32"/>
+        </w:rPr>
+        <w:t>)</w:t>
+      </w:r>
+      <w:r>
+        <w:rPr>
+          <w:sz w:val="32"/>
+          <w:szCs w:val="32"/>
+        </w:rPr>
+        <w:t>)</w:t>
+      </w:r>
+      <w:r>
+        <w:rPr>
+          <w:sz w:val="32"/>
+          <w:szCs w:val="32"/>
+        </w:rPr>
+        <w:t>.</w:t>
+      </w:r>
+    </w:p>
+    <w:p>
+      <w:pPr>
+        <w:jc w:val="both"/>
+        <w:rPr>
+          <w:b/>
+          <w:bCs/>
+          <w:color w:val="D86DCB" w:themeColor="accent5" w:themeTint="99"/>
+          <w:sz w:val="32"/>
+          <w:szCs w:val="32"/>
+        </w:rPr>
+      </w:pPr>
+      <w:r>
+        <w:rPr>
+          <w:b/>
+          <w:bCs/>
+          <w:color w:val="D86DCB" w:themeColor="accent5" w:themeTint="99"/>
+          <w:sz w:val="32"/>
+          <w:szCs w:val="32"/>
+        </w:rPr>
+        <w:t>class Duck:</w:t>
+      </w:r>
+    </w:p>
+    <w:p>
+      <w:pPr>
+        <w:jc w:val="both"/>
+        <w:rPr>
+          <w:b/>
+          <w:bCs/>
+          <w:color w:val="D86DCB" w:themeColor="accent5" w:themeTint="99"/>
+          <w:sz w:val="32"/>
+          <w:szCs w:val="32"/>
+        </w:rPr>
+      </w:pPr>
+      <w:r>
+        <w:rPr>
+          <w:b/>
+          <w:bCs/>
+          <w:color w:val="D86DCB" w:themeColor="accent5" w:themeTint="99"/>
+          <w:sz w:val="32"/>
+          <w:szCs w:val="32"/>
+        </w:rPr>
+        <w:t xml:space="preserve">    def speak(self):</w:t>
+      </w:r>
+    </w:p>
+    <w:p>
+      <w:pPr>
+        <w:jc w:val="both"/>
+        <w:rPr>
+          <w:b/>
+          <w:bCs/>
+          <w:color w:val="D86DCB" w:themeColor="accent5" w:themeTint="99"/>
+          <w:sz w:val="32"/>
+          <w:szCs w:val="32"/>
+        </w:rPr>
+      </w:pPr>
+      <w:r>
+        <w:rPr>
+          <w:b/>
+          <w:bCs/>
+          <w:color w:val="D86DCB" w:themeColor="accent5" w:themeTint="99"/>
+          <w:sz w:val="32"/>
+          <w:szCs w:val="32"/>
+        </w:rPr>
+        <w:t xml:space="preserve">        print("Quack")</w:t>
+      </w:r>
+    </w:p>
+    <w:p>
+      <w:pPr>
+        <w:jc w:val="both"/>
+        <w:rPr>
+          <w:b/>
+          <w:bCs/>
+          <w:color w:val="D86DCB" w:themeColor="accent5" w:themeTint="99"/>
+          <w:sz w:val="32"/>
+          <w:szCs w:val="32"/>
+        </w:rPr>
+      </w:pPr>
+    </w:p>
+    <w:p>
+      <w:pPr>
+        <w:jc w:val="both"/>
+        <w:rPr>
+          <w:b/>
+          <w:bCs/>
+          <w:color w:val="D86DCB" w:themeColor="accent5" w:themeTint="99"/>
+          <w:sz w:val="32"/>
+          <w:szCs w:val="32"/>
+        </w:rPr>
+      </w:pPr>
+      <w:r>
+        <w:rPr>
+          <w:b/>
+          <w:bCs/>
+          <w:color w:val="D86DCB" w:themeColor="accent5" w:themeTint="99"/>
+          <w:sz w:val="32"/>
+          <w:szCs w:val="32"/>
+        </w:rPr>
+        <w:t>class Person:</w:t>
+      </w:r>
+    </w:p>
+    <w:p>
+      <w:pPr>
+        <w:jc w:val="both"/>
+        <w:rPr>
+          <w:b/>
+          <w:bCs/>
+          <w:color w:val="D86DCB" w:themeColor="accent5" w:themeTint="99"/>
+          <w:sz w:val="32"/>
+          <w:szCs w:val="32"/>
+        </w:rPr>
+      </w:pPr>
+      <w:r>
+        <w:rPr>
+          <w:b/>
+          <w:bCs/>
+          <w:color w:val="D86DCB" w:themeColor="accent5" w:themeTint="99"/>
+          <w:sz w:val="32"/>
+          <w:szCs w:val="32"/>
+        </w:rPr>
+        <w:t xml:space="preserve">    def speak(self):</w:t>
+      </w:r>
+    </w:p>
+    <w:p>
+      <w:pPr>
+        <w:jc w:val="both"/>
+        <w:rPr>
+          <w:b/>
+          <w:bCs/>
+          <w:color w:val="D86DCB" w:themeColor="accent5" w:themeTint="99"/>
+          <w:sz w:val="32"/>
+          <w:szCs w:val="32"/>
+        </w:rPr>
+      </w:pPr>
+      <w:r>
+        <w:rPr>
+          <w:b/>
+          <w:bCs/>
+          <w:color w:val="D86DCB" w:themeColor="accent5" w:themeTint="99"/>
+          <w:sz w:val="32"/>
+          <w:szCs w:val="32"/>
+        </w:rPr>
         <w:lastRenderedPageBreak/>
-        <w:t>Duck Typing:</w:t>
-      </w:r>
-    </w:p>
-    <w:p>
-      <w:pPr>
-        <w:jc w:val="both"/>
-        <w:rPr>
-          <w:sz w:val="32"/>
-          <w:szCs w:val="32"/>
-        </w:rPr>
-      </w:pPr>
-      <w:r>
-        <w:rPr>
-          <w:sz w:val="32"/>
-          <w:szCs w:val="32"/>
-        </w:rPr>
-        <w:t xml:space="preserve"># </w:t>
-      </w:r>
-      <w:r>
-        <w:rPr>
-          <w:sz w:val="32"/>
-          <w:szCs w:val="32"/>
-        </w:rPr>
-        <w:t>This is one of Python's unique philosophies.</w:t>
-      </w:r>
-      <w:r>
-        <w:rPr>
-          <w:sz w:val="32"/>
-          <w:szCs w:val="32"/>
-        </w:rPr>
-        <w:t xml:space="preserve"> </w:t>
-      </w:r>
-      <w:r>
-        <w:rPr>
-          <w:sz w:val="32"/>
-          <w:szCs w:val="32"/>
-        </w:rPr>
-        <w:t>The saying is</w:t>
-      </w:r>
-      <w:r>
-        <w:rPr>
-          <w:sz w:val="32"/>
-          <w:szCs w:val="32"/>
-        </w:rPr>
-        <w:t xml:space="preserve"> </w:t>
-      </w:r>
-      <w:r>
-        <w:rPr>
-          <w:sz w:val="32"/>
-          <w:szCs w:val="32"/>
-        </w:rPr>
-        <w:t>"If it walks like a duck and quacks like a duck, then it's a duck."</w:t>
-      </w:r>
-    </w:p>
-    <w:p>
-      <w:pPr>
-        <w:jc w:val="both"/>
-        <w:rPr>
-          <w:sz w:val="32"/>
-          <w:szCs w:val="32"/>
-        </w:rPr>
-      </w:pPr>
-      <w:r>
-        <w:rPr>
-          <w:sz w:val="32"/>
-          <w:szCs w:val="32"/>
-        </w:rPr>
-        <w:t xml:space="preserve"># </w:t>
-      </w:r>
-      <w:r>
-        <w:rPr>
-          <w:sz w:val="32"/>
-          <w:szCs w:val="32"/>
-        </w:rPr>
-        <w:t>Python doesn't care about the object's type</w:t>
-      </w:r>
-      <w:r>
-        <w:rPr>
-          <w:sz w:val="32"/>
-          <w:szCs w:val="32"/>
-        </w:rPr>
-        <w:t xml:space="preserve"> (</w:t>
-      </w:r>
-      <w:r>
-        <w:rPr>
-          <w:b/>
-          <w:bCs/>
-          <w:sz w:val="32"/>
-          <w:szCs w:val="32"/>
-        </w:rPr>
-        <w:t>Duck</w:t>
-      </w:r>
-      <w:r>
-        <w:rPr>
-          <w:sz w:val="32"/>
-          <w:szCs w:val="32"/>
-        </w:rPr>
-        <w:t xml:space="preserve"> or </w:t>
-      </w:r>
-      <w:r>
-        <w:rPr>
-          <w:b/>
-          <w:bCs/>
-          <w:sz w:val="32"/>
-          <w:szCs w:val="32"/>
-        </w:rPr>
-        <w:t>Person</w:t>
-      </w:r>
-      <w:r>
-        <w:rPr>
-          <w:sz w:val="32"/>
-          <w:szCs w:val="32"/>
-        </w:rPr>
-        <w:t>)</w:t>
-      </w:r>
-      <w:r>
-        <w:rPr>
-          <w:sz w:val="32"/>
-          <w:szCs w:val="32"/>
-        </w:rPr>
-        <w:t>.</w:t>
-      </w:r>
-      <w:r>
-        <w:rPr>
-          <w:sz w:val="32"/>
-          <w:szCs w:val="32"/>
-        </w:rPr>
-        <w:t xml:space="preserve"> </w:t>
-      </w:r>
-      <w:r>
-        <w:rPr>
-          <w:sz w:val="32"/>
-          <w:szCs w:val="32"/>
-        </w:rPr>
-        <w:t>It cares whether the object has the required methods</w:t>
-      </w:r>
-      <w:r>
-        <w:rPr>
-          <w:sz w:val="32"/>
-          <w:szCs w:val="32"/>
-        </w:rPr>
-        <w:t xml:space="preserve"> (</w:t>
-      </w:r>
-      <w:proofErr w:type="gramStart"/>
-      <w:r>
-        <w:rPr>
-          <w:b/>
-          <w:bCs/>
-          <w:sz w:val="32"/>
-          <w:szCs w:val="32"/>
-        </w:rPr>
-        <w:t>speak(</w:t>
-      </w:r>
-      <w:proofErr w:type="gramEnd"/>
-      <w:r>
-        <w:rPr>
-          <w:b/>
-          <w:bCs/>
-          <w:sz w:val="32"/>
-          <w:szCs w:val="32"/>
-        </w:rPr>
-        <w:t>)</w:t>
-      </w:r>
-      <w:r>
-        <w:rPr>
-          <w:sz w:val="32"/>
-          <w:szCs w:val="32"/>
-        </w:rPr>
-        <w:t>)</w:t>
-      </w:r>
-      <w:r>
-        <w:rPr>
-          <w:sz w:val="32"/>
-          <w:szCs w:val="32"/>
-        </w:rPr>
-        <w:t>.</w:t>
-      </w:r>
-    </w:p>
-    <w:p>
-      <w:pPr>
-        <w:jc w:val="both"/>
-        <w:rPr>
-          <w:b/>
-          <w:bCs/>
-          <w:color w:val="D86DCB" w:themeColor="accent5" w:themeTint="99"/>
-          <w:sz w:val="32"/>
-          <w:szCs w:val="32"/>
-        </w:rPr>
-      </w:pPr>
-      <w:r>
-        <w:rPr>
-          <w:b/>
-          <w:bCs/>
-          <w:color w:val="D86DCB" w:themeColor="accent5" w:themeTint="99"/>
-          <w:sz w:val="32"/>
-          <w:szCs w:val="32"/>
-        </w:rPr>
-        <w:t>class Duck:</w:t>
-      </w:r>
-    </w:p>
-    <w:p>
-      <w:pPr>
-        <w:jc w:val="both"/>
-        <w:rPr>
-          <w:b/>
-          <w:bCs/>
-          <w:color w:val="D86DCB" w:themeColor="accent5" w:themeTint="99"/>
-          <w:sz w:val="32"/>
-          <w:szCs w:val="32"/>
-        </w:rPr>
-      </w:pPr>
-      <w:r>
-        <w:rPr>
-          <w:b/>
-          <w:bCs/>
-          <w:color w:val="D86DCB" w:themeColor="accent5" w:themeTint="99"/>
-          <w:sz w:val="32"/>
-          <w:szCs w:val="32"/>
-        </w:rPr>
-        <w:t xml:space="preserve">    def speak(self):</w:t>
-      </w:r>
-    </w:p>
-    <w:p>
-      <w:pPr>
-        <w:jc w:val="both"/>
-        <w:rPr>
-          <w:b/>
-          <w:bCs/>
-          <w:color w:val="D86DCB" w:themeColor="accent5" w:themeTint="99"/>
-          <w:sz w:val="32"/>
-          <w:szCs w:val="32"/>
-        </w:rPr>
-      </w:pPr>
-      <w:r>
-        <w:rPr>
-          <w:b/>
-          <w:bCs/>
-          <w:color w:val="D86DCB" w:themeColor="accent5" w:themeTint="99"/>
-          <w:sz w:val="32"/>
-          <w:szCs w:val="32"/>
-        </w:rPr>
-        <w:t xml:space="preserve">        print("Quack")</w:t>
-      </w:r>
-    </w:p>
-    <w:p>
-      <w:pPr>
-        <w:jc w:val="both"/>
-        <w:rPr>
-          <w:b/>
-          <w:bCs/>
-          <w:color w:val="D86DCB" w:themeColor="accent5" w:themeTint="99"/>
-          <w:sz w:val="32"/>
-          <w:szCs w:val="32"/>
-        </w:rPr>
-      </w:pPr>
-    </w:p>
-    <w:p>
-      <w:pPr>
-        <w:jc w:val="both"/>
-        <w:rPr>
-          <w:b/>
-          <w:bCs/>
-          <w:color w:val="D86DCB" w:themeColor="accent5" w:themeTint="99"/>
-          <w:sz w:val="32"/>
-          <w:szCs w:val="32"/>
-        </w:rPr>
-      </w:pPr>
-      <w:r>
-        <w:rPr>
-          <w:b/>
-          <w:bCs/>
-          <w:color w:val="D86DCB" w:themeColor="accent5" w:themeTint="99"/>
-          <w:sz w:val="32"/>
-          <w:szCs w:val="32"/>
-        </w:rPr>
-        <w:t>class Person:</w:t>
-      </w:r>
-    </w:p>
-    <w:p>
-      <w:pPr>
-        <w:jc w:val="both"/>
-        <w:rPr>
-          <w:b/>
-          <w:bCs/>
-          <w:color w:val="D86DCB" w:themeColor="accent5" w:themeTint="99"/>
-          <w:sz w:val="32"/>
-          <w:szCs w:val="32"/>
-        </w:rPr>
-      </w:pPr>
-      <w:r>
-        <w:rPr>
-          <w:b/>
-          <w:bCs/>
-          <w:color w:val="D86DCB" w:themeColor="accent5" w:themeTint="99"/>
-          <w:sz w:val="32"/>
-          <w:szCs w:val="32"/>
-        </w:rPr>
-        <w:t xml:space="preserve">    def speak(self):</w:t>
-      </w:r>
-    </w:p>
-    <w:p>
-      <w:pPr>
-        <w:jc w:val="both"/>
-        <w:rPr>
-          <w:b/>
-          <w:bCs/>
-          <w:color w:val="D86DCB" w:themeColor="accent5" w:themeTint="99"/>
-          <w:sz w:val="32"/>
-          <w:szCs w:val="32"/>
-        </w:rPr>
-      </w:pPr>
-      <w:r>
-        <w:rPr>
-          <w:b/>
-          <w:bCs/>
-          <w:color w:val="D86DCB" w:themeColor="accent5" w:themeTint="99"/>
-          <w:sz w:val="32"/>
-          <w:szCs w:val="32"/>
-        </w:rPr>
         <w:t xml:space="preserve">        print("Hello")</w:t>
       </w:r>
     </w:p>
@@ -16302,7 +17035,266 @@
           <w:sz w:val="32"/>
           <w:szCs w:val="32"/>
         </w:rPr>
+        <w:t xml:space="preserve"># </w:t>
+      </w:r>
+      <w:r>
+        <w:rPr>
+          <w:sz w:val="32"/>
+          <w:szCs w:val="32"/>
+        </w:rPr>
+        <w:t>Python only checks</w:t>
+      </w:r>
+      <w:r>
+        <w:rPr>
+          <w:sz w:val="32"/>
+          <w:szCs w:val="32"/>
+        </w:rPr>
+        <w:t xml:space="preserve"> does this object have </w:t>
+      </w:r>
+      <w:proofErr w:type="gramStart"/>
+      <w:r>
+        <w:rPr>
+          <w:b/>
+          <w:bCs/>
+          <w:sz w:val="32"/>
+          <w:szCs w:val="32"/>
+        </w:rPr>
+        <w:t>speak(</w:t>
+      </w:r>
+      <w:proofErr w:type="gramEnd"/>
+      <w:r>
+        <w:rPr>
+          <w:b/>
+          <w:bCs/>
+          <w:sz w:val="32"/>
+          <w:szCs w:val="32"/>
+        </w:rPr>
+        <w:t>)</w:t>
+      </w:r>
+      <w:r>
+        <w:rPr>
+          <w:sz w:val="32"/>
+          <w:szCs w:val="32"/>
+        </w:rPr>
+        <w:t xml:space="preserve"> if not throws </w:t>
+      </w:r>
+      <w:proofErr w:type="spellStart"/>
+      <w:r>
+        <w:rPr>
+          <w:b/>
+          <w:bCs/>
+          <w:sz w:val="32"/>
+          <w:szCs w:val="32"/>
+        </w:rPr>
+        <w:t>AttributeError</w:t>
+      </w:r>
+      <w:proofErr w:type="spellEnd"/>
+    </w:p>
+    <w:p>
+      <w:pPr>
+        <w:jc w:val="both"/>
+        <w:rPr>
+          <w:sz w:val="32"/>
+          <w:szCs w:val="32"/>
+        </w:rPr>
+      </w:pPr>
+    </w:p>
+    <w:p>
+      <w:pPr>
+        <w:jc w:val="center"/>
+        <w:rPr>
+          <w:sz w:val="32"/>
+          <w:szCs w:val="32"/>
+        </w:rPr>
+      </w:pPr>
+      <w:r>
+        <w:rPr>
+          <w:sz w:val="32"/>
+          <w:szCs w:val="32"/>
+        </w:rPr>
+        <w:t>Break</w:t>
+      </w:r>
+    </w:p>
+    <w:p>
+      <w:pPr>
+        <w:jc w:val="both"/>
+        <w:rPr>
+          <w:sz w:val="32"/>
+          <w:szCs w:val="32"/>
+        </w:rPr>
+      </w:pPr>
+    </w:p>
+    <w:p>
+      <w:pPr>
+        <w:jc w:val="both"/>
+        <w:rPr>
+          <w:b/>
+          <w:bCs/>
+          <w:sz w:val="32"/>
+          <w:szCs w:val="32"/>
+        </w:rPr>
+      </w:pPr>
+      <w:r>
+        <w:rPr>
+          <w:b/>
+          <w:bCs/>
+          <w:sz w:val="32"/>
+          <w:szCs w:val="32"/>
+        </w:rPr>
+        <w:t>Abstract Classes:</w:t>
+      </w:r>
+    </w:p>
+    <w:p>
+      <w:pPr>
+        <w:jc w:val="both"/>
+        <w:rPr>
+          <w:sz w:val="32"/>
+          <w:szCs w:val="32"/>
+        </w:rPr>
+      </w:pPr>
+      <w:r>
+        <w:rPr>
+          <w:sz w:val="32"/>
+          <w:szCs w:val="32"/>
+        </w:rPr>
+        <w:t># Abstract classes can’t be instantiable or object can’t be created. It only specifies methods to override or implement (rules to specify).</w:t>
+      </w:r>
+    </w:p>
+    <w:p>
+      <w:pPr>
+        <w:jc w:val="both"/>
+        <w:rPr>
+          <w:sz w:val="32"/>
+          <w:szCs w:val="32"/>
+        </w:rPr>
+      </w:pPr>
+      <w:r>
+        <w:rPr>
+          <w:sz w:val="32"/>
+          <w:szCs w:val="32"/>
+        </w:rPr>
+        <w:t># Abstraction only exposes the implementation and hid</w:t>
+      </w:r>
+      <w:r>
+        <w:rPr>
+          <w:sz w:val="32"/>
+          <w:szCs w:val="32"/>
+        </w:rPr>
+        <w:t>es</w:t>
+      </w:r>
+      <w:r>
+        <w:rPr>
+          <w:sz w:val="32"/>
+          <w:szCs w:val="32"/>
+        </w:rPr>
+        <w:t xml:space="preserve"> the complexity (</w:t>
+      </w:r>
+      <w:r>
+        <w:rPr>
+          <w:sz w:val="32"/>
+          <w:szCs w:val="32"/>
+        </w:rPr>
+        <w:t>other properties and code</w:t>
+      </w:r>
+      <w:r>
+        <w:rPr>
+          <w:sz w:val="32"/>
+          <w:szCs w:val="32"/>
+        </w:rPr>
+        <w:t>)</w:t>
+      </w:r>
+      <w:r>
+        <w:rPr>
+          <w:sz w:val="32"/>
+          <w:szCs w:val="32"/>
+        </w:rPr>
+        <w:t>. It can only be inherited to implement or override the specified methods (interface class design)</w:t>
+      </w:r>
+    </w:p>
+    <w:p>
+      <w:pPr>
+        <w:jc w:val="both"/>
+        <w:rPr>
+          <w:sz w:val="32"/>
+          <w:szCs w:val="32"/>
+        </w:rPr>
+      </w:pPr>
+      <w:r>
+        <w:rPr>
+          <w:sz w:val="32"/>
+          <w:szCs w:val="32"/>
+        </w:rPr>
         <w:lastRenderedPageBreak/>
+        <w:t xml:space="preserve"># It’s used to enforce a set of rules (methods) on child classes that they need to implement like specifying Cash Out Charge Rate (Mandatory rule) for </w:t>
+      </w:r>
+      <w:proofErr w:type="spellStart"/>
+      <w:r>
+        <w:rPr>
+          <w:b/>
+          <w:bCs/>
+          <w:sz w:val="32"/>
+          <w:szCs w:val="32"/>
+        </w:rPr>
+        <w:t>Bkash</w:t>
+      </w:r>
+      <w:proofErr w:type="spellEnd"/>
+      <w:r>
+        <w:rPr>
+          <w:sz w:val="32"/>
+          <w:szCs w:val="32"/>
+        </w:rPr>
+        <w:t xml:space="preserve"> and </w:t>
+      </w:r>
+      <w:proofErr w:type="spellStart"/>
+      <w:r>
+        <w:rPr>
+          <w:b/>
+          <w:bCs/>
+          <w:sz w:val="32"/>
+          <w:szCs w:val="32"/>
+        </w:rPr>
+        <w:t>Nagad</w:t>
+      </w:r>
+      <w:proofErr w:type="spellEnd"/>
+    </w:p>
+    <w:p>
+      <w:pPr>
+        <w:jc w:val="both"/>
+        <w:rPr>
+          <w:sz w:val="32"/>
+          <w:szCs w:val="32"/>
+        </w:rPr>
+      </w:pPr>
+    </w:p>
+    <w:p>
+      <w:pPr>
+        <w:jc w:val="both"/>
+        <w:rPr>
+          <w:sz w:val="32"/>
+          <w:szCs w:val="32"/>
+        </w:rPr>
+      </w:pPr>
+      <w:r>
+        <w:rPr>
+          <w:sz w:val="32"/>
+          <w:szCs w:val="32"/>
+        </w:rPr>
+        <w:t>Basic Usage:</w:t>
+      </w:r>
+    </w:p>
+    <w:p>
+      <w:pPr>
+        <w:jc w:val="both"/>
+        <w:rPr>
+          <w:sz w:val="32"/>
+          <w:szCs w:val="32"/>
+        </w:rPr>
+      </w:pPr>
+      <w:r>
+        <w:rPr>
+          <w:sz w:val="32"/>
+          <w:szCs w:val="32"/>
+        </w:rPr>
         <w:t xml:space="preserve"># </w:t>
       </w:r>
       <w:r>
@@ -16310,41 +17302,7 @@
           <w:sz w:val="32"/>
           <w:szCs w:val="32"/>
         </w:rPr>
-        <w:t>Python only checks</w:t>
-      </w:r>
-      <w:r>
-        <w:rPr>
-          <w:sz w:val="32"/>
-          <w:szCs w:val="32"/>
-        </w:rPr>
-        <w:t xml:space="preserve"> does this object have </w:t>
-      </w:r>
-      <w:proofErr w:type="gramStart"/>
-      <w:r>
-        <w:rPr>
-          <w:b/>
-          <w:bCs/>
-          <w:sz w:val="32"/>
-          <w:szCs w:val="32"/>
-        </w:rPr>
-        <w:t>speak(</w:t>
-      </w:r>
-      <w:proofErr w:type="gramEnd"/>
-      <w:r>
-        <w:rPr>
-          <w:b/>
-          <w:bCs/>
-          <w:sz w:val="32"/>
-          <w:szCs w:val="32"/>
-        </w:rPr>
-        <w:t>)</w:t>
-      </w:r>
-      <w:r>
-        <w:rPr>
-          <w:sz w:val="32"/>
-          <w:szCs w:val="32"/>
-        </w:rPr>
-        <w:t xml:space="preserve"> if not throws </w:t>
+        <w:t xml:space="preserve">Python provides the </w:t>
       </w:r>
       <w:proofErr w:type="spellStart"/>
       <w:r>
@@ -16354,145 +17312,38 @@
           <w:sz w:val="32"/>
           <w:szCs w:val="32"/>
         </w:rPr>
-        <w:t>AttributeError</w:t>
+        <w:t>abc</w:t>
       </w:r>
       <w:proofErr w:type="spellEnd"/>
-    </w:p>
-    <w:p>
-      <w:pPr>
-        <w:jc w:val="both"/>
-        <w:rPr>
-          <w:sz w:val="32"/>
-          <w:szCs w:val="32"/>
-        </w:rPr>
-      </w:pPr>
-    </w:p>
-    <w:p>
-      <w:pPr>
-        <w:jc w:val="center"/>
-        <w:rPr>
-          <w:sz w:val="32"/>
-          <w:szCs w:val="32"/>
-        </w:rPr>
-      </w:pPr>
-      <w:r>
-        <w:rPr>
-          <w:sz w:val="32"/>
-          <w:szCs w:val="32"/>
-        </w:rPr>
-        <w:t>Break</w:t>
-      </w:r>
-    </w:p>
-    <w:p>
-      <w:pPr>
-        <w:jc w:val="both"/>
-        <w:rPr>
-          <w:sz w:val="32"/>
-          <w:szCs w:val="32"/>
-        </w:rPr>
-      </w:pPr>
-    </w:p>
-    <w:p>
-      <w:pPr>
-        <w:jc w:val="both"/>
-        <w:rPr>
-          <w:b/>
-          <w:bCs/>
-          <w:sz w:val="32"/>
-          <w:szCs w:val="32"/>
-        </w:rPr>
-      </w:pPr>
-      <w:r>
-        <w:rPr>
-          <w:b/>
-          <w:bCs/>
-          <w:sz w:val="32"/>
-          <w:szCs w:val="32"/>
-        </w:rPr>
-        <w:t>Abstract Classes:</w:t>
-      </w:r>
-    </w:p>
-    <w:p>
-      <w:pPr>
-        <w:jc w:val="both"/>
-        <w:rPr>
-          <w:sz w:val="32"/>
-          <w:szCs w:val="32"/>
-        </w:rPr>
-      </w:pPr>
-      <w:r>
-        <w:rPr>
-          <w:sz w:val="32"/>
-          <w:szCs w:val="32"/>
-        </w:rPr>
-        <w:t># Abstract classes can’t be instantiable or object can’t be created. It only specifies methods to override or implement (rules to specify).</w:t>
-      </w:r>
-    </w:p>
-    <w:p>
-      <w:pPr>
-        <w:jc w:val="both"/>
-        <w:rPr>
-          <w:sz w:val="32"/>
-          <w:szCs w:val="32"/>
-        </w:rPr>
-      </w:pPr>
-      <w:r>
-        <w:rPr>
-          <w:sz w:val="32"/>
-          <w:szCs w:val="32"/>
-        </w:rPr>
-        <w:t># Abstraction only exposes the implementation and hid</w:t>
-      </w:r>
-      <w:r>
-        <w:rPr>
-          <w:sz w:val="32"/>
-          <w:szCs w:val="32"/>
-        </w:rPr>
-        <w:t>es</w:t>
-      </w:r>
-      <w:r>
-        <w:rPr>
-          <w:sz w:val="32"/>
-          <w:szCs w:val="32"/>
-        </w:rPr>
-        <w:t xml:space="preserve"> the complexity (</w:t>
-      </w:r>
-      <w:r>
-        <w:rPr>
-          <w:sz w:val="32"/>
-          <w:szCs w:val="32"/>
-        </w:rPr>
-        <w:t>other properties and code</w:t>
-      </w:r>
-      <w:r>
-        <w:rPr>
-          <w:sz w:val="32"/>
-          <w:szCs w:val="32"/>
-        </w:rPr>
-        <w:t>)</w:t>
-      </w:r>
-      <w:r>
-        <w:rPr>
-          <w:sz w:val="32"/>
-          <w:szCs w:val="32"/>
-        </w:rPr>
-        <w:t>. It can only be inherited to implement or override the specified methods (interface class design)</w:t>
-      </w:r>
-    </w:p>
-    <w:p>
-      <w:pPr>
-        <w:jc w:val="both"/>
-        <w:rPr>
-          <w:sz w:val="32"/>
-          <w:szCs w:val="32"/>
-        </w:rPr>
-      </w:pPr>
-      <w:r>
-        <w:rPr>
-          <w:sz w:val="32"/>
-          <w:szCs w:val="32"/>
-        </w:rPr>
-        <w:t xml:space="preserve"># It’s used to enforce a set of rules (methods) on child classes that they need to implement like specifying Cash Out Charge Rate (Mandatory rule) for </w:t>
+      <w:r>
+        <w:rPr>
+          <w:sz w:val="32"/>
+          <w:szCs w:val="32"/>
+        </w:rPr>
+        <w:t xml:space="preserve"> module</w:t>
+      </w:r>
+      <w:r>
+        <w:rPr>
+          <w:sz w:val="32"/>
+          <w:szCs w:val="32"/>
+        </w:rPr>
+        <w:t xml:space="preserve"> for importing </w:t>
+      </w:r>
+      <w:r>
+        <w:rPr>
+          <w:b/>
+          <w:bCs/>
+          <w:sz w:val="32"/>
+          <w:szCs w:val="32"/>
+        </w:rPr>
+        <w:t>ABC</w:t>
+      </w:r>
+      <w:r>
+        <w:rPr>
+          <w:sz w:val="32"/>
+          <w:szCs w:val="32"/>
+        </w:rPr>
+        <w:t xml:space="preserve"> and </w:t>
       </w:r>
       <w:proofErr w:type="spellStart"/>
       <w:r>
@@ -16502,7 +17353,7 @@
           <w:sz w:val="32"/>
           <w:szCs w:val="32"/>
         </w:rPr>
-        <w:t>Bkash</w:t>
+        <w:t>abstractmethod</w:t>
       </w:r>
       <w:proofErr w:type="spellEnd"/>
       <w:r>
@@ -16510,214 +17361,96 @@
           <w:sz w:val="32"/>
           <w:szCs w:val="32"/>
         </w:rPr>
-        <w:t xml:space="preserve"> and </w:t>
+        <w:t>.</w:t>
+      </w:r>
+    </w:p>
+    <w:p>
+      <w:pPr>
+        <w:jc w:val="both"/>
+        <w:rPr>
+          <w:sz w:val="32"/>
+          <w:szCs w:val="32"/>
+        </w:rPr>
+      </w:pPr>
+      <w:r>
+        <w:rPr>
+          <w:sz w:val="32"/>
+          <w:szCs w:val="32"/>
+        </w:rPr>
+        <w:t>#</w:t>
+      </w:r>
+      <w:r>
+        <w:rPr>
+          <w:b/>
+          <w:bCs/>
+          <w:sz w:val="32"/>
+          <w:szCs w:val="32"/>
+        </w:rPr>
+        <w:t xml:space="preserve"> @abstractmethod</w:t>
+      </w:r>
+      <w:r>
+        <w:rPr>
+          <w:sz w:val="32"/>
+          <w:szCs w:val="32"/>
+        </w:rPr>
+        <w:t xml:space="preserve"> decorator is used to declare an abstract method that has no implementation and every child class must implement or define (override) it</w:t>
+      </w:r>
+    </w:p>
+    <w:p>
+      <w:pPr>
+        <w:jc w:val="both"/>
+        <w:rPr>
+          <w:b/>
+          <w:bCs/>
+          <w:color w:val="D86DCB" w:themeColor="accent5" w:themeTint="99"/>
+          <w:sz w:val="32"/>
+          <w:szCs w:val="32"/>
+        </w:rPr>
+      </w:pPr>
+      <w:r>
+        <w:rPr>
+          <w:b/>
+          <w:bCs/>
+          <w:color w:val="D86DCB" w:themeColor="accent5" w:themeTint="99"/>
+          <w:sz w:val="32"/>
+          <w:szCs w:val="32"/>
+        </w:rPr>
+        <w:t xml:space="preserve">from </w:t>
       </w:r>
       <w:proofErr w:type="spellStart"/>
       <w:r>
         <w:rPr>
           <w:b/>
           <w:bCs/>
-          <w:sz w:val="32"/>
-          <w:szCs w:val="32"/>
-        </w:rPr>
-        <w:t>Nagad</w:t>
+          <w:color w:val="D86DCB" w:themeColor="accent5" w:themeTint="99"/>
+          <w:sz w:val="32"/>
+          <w:szCs w:val="32"/>
+        </w:rPr>
+        <w:t>abc</w:t>
       </w:r>
       <w:proofErr w:type="spellEnd"/>
-    </w:p>
-    <w:p>
-      <w:pPr>
-        <w:jc w:val="both"/>
-        <w:rPr>
-          <w:sz w:val="32"/>
-          <w:szCs w:val="32"/>
-        </w:rPr>
-      </w:pPr>
-    </w:p>
-    <w:p>
-      <w:pPr>
-        <w:jc w:val="both"/>
-        <w:rPr>
-          <w:sz w:val="32"/>
-          <w:szCs w:val="32"/>
-        </w:rPr>
-      </w:pPr>
-      <w:r>
-        <w:rPr>
-          <w:sz w:val="32"/>
-          <w:szCs w:val="32"/>
-        </w:rPr>
-        <w:t>Basic Usage:</w:t>
-      </w:r>
-    </w:p>
-    <w:p>
-      <w:pPr>
-        <w:jc w:val="both"/>
-        <w:rPr>
-          <w:sz w:val="32"/>
-          <w:szCs w:val="32"/>
-        </w:rPr>
-      </w:pPr>
-      <w:r>
-        <w:rPr>
-          <w:sz w:val="32"/>
-          <w:szCs w:val="32"/>
-        </w:rPr>
-        <w:t xml:space="preserve"># </w:t>
-      </w:r>
-      <w:r>
-        <w:rPr>
-          <w:sz w:val="32"/>
-          <w:szCs w:val="32"/>
-        </w:rPr>
-        <w:t xml:space="preserve">Python provides the </w:t>
+      <w:r>
+        <w:rPr>
+          <w:b/>
+          <w:bCs/>
+          <w:color w:val="D86DCB" w:themeColor="accent5" w:themeTint="99"/>
+          <w:sz w:val="32"/>
+          <w:szCs w:val="32"/>
+        </w:rPr>
+        <w:t xml:space="preserve"> import ABC, </w:t>
       </w:r>
       <w:proofErr w:type="spellStart"/>
       <w:r>
         <w:rPr>
           <w:b/>
           <w:bCs/>
-          <w:sz w:val="32"/>
-          <w:szCs w:val="32"/>
-        </w:rPr>
-        <w:t>abc</w:t>
+          <w:color w:val="D86DCB" w:themeColor="accent5" w:themeTint="99"/>
+          <w:sz w:val="32"/>
+          <w:szCs w:val="32"/>
+        </w:rPr>
+        <w:t>abstractmethod</w:t>
       </w:r>
       <w:proofErr w:type="spellEnd"/>
-      <w:r>
-        <w:rPr>
-          <w:sz w:val="32"/>
-          <w:szCs w:val="32"/>
-        </w:rPr>
-        <w:t xml:space="preserve"> module</w:t>
-      </w:r>
-      <w:r>
-        <w:rPr>
-          <w:sz w:val="32"/>
-          <w:szCs w:val="32"/>
-        </w:rPr>
-        <w:t xml:space="preserve"> for importing </w:t>
-      </w:r>
-      <w:r>
-        <w:rPr>
-          <w:b/>
-          <w:bCs/>
-          <w:sz w:val="32"/>
-          <w:szCs w:val="32"/>
-        </w:rPr>
-        <w:t>ABC</w:t>
-      </w:r>
-      <w:r>
-        <w:rPr>
-          <w:sz w:val="32"/>
-          <w:szCs w:val="32"/>
-        </w:rPr>
-        <w:t xml:space="preserve"> and </w:t>
-      </w:r>
-      <w:proofErr w:type="spellStart"/>
-      <w:r>
-        <w:rPr>
-          <w:b/>
-          <w:bCs/>
-          <w:sz w:val="32"/>
-          <w:szCs w:val="32"/>
-        </w:rPr>
-        <w:t>abstractmethod</w:t>
-      </w:r>
-      <w:proofErr w:type="spellEnd"/>
-      <w:r>
-        <w:rPr>
-          <w:sz w:val="32"/>
-          <w:szCs w:val="32"/>
-        </w:rPr>
-        <w:t>.</w:t>
-      </w:r>
-    </w:p>
-    <w:p>
-      <w:pPr>
-        <w:jc w:val="both"/>
-        <w:rPr>
-          <w:sz w:val="32"/>
-          <w:szCs w:val="32"/>
-        </w:rPr>
-      </w:pPr>
-      <w:r>
-        <w:rPr>
-          <w:sz w:val="32"/>
-          <w:szCs w:val="32"/>
-        </w:rPr>
-        <w:t>#</w:t>
-      </w:r>
-      <w:r>
-        <w:rPr>
-          <w:b/>
-          <w:bCs/>
-          <w:sz w:val="32"/>
-          <w:szCs w:val="32"/>
-        </w:rPr>
-        <w:t xml:space="preserve"> @abstractmethod</w:t>
-      </w:r>
-      <w:r>
-        <w:rPr>
-          <w:sz w:val="32"/>
-          <w:szCs w:val="32"/>
-        </w:rPr>
-        <w:t xml:space="preserve"> decorator is used to declare an abstract method that has no implementation and every child class must implement or define (override) it</w:t>
-      </w:r>
-    </w:p>
-    <w:p>
-      <w:pPr>
-        <w:jc w:val="both"/>
-        <w:rPr>
-          <w:b/>
-          <w:bCs/>
-          <w:color w:val="D86DCB" w:themeColor="accent5" w:themeTint="99"/>
-          <w:sz w:val="32"/>
-          <w:szCs w:val="32"/>
-        </w:rPr>
-      </w:pPr>
-      <w:r>
-        <w:rPr>
-          <w:b/>
-          <w:bCs/>
-          <w:color w:val="D86DCB" w:themeColor="accent5" w:themeTint="99"/>
-          <w:sz w:val="32"/>
-          <w:szCs w:val="32"/>
-        </w:rPr>
-        <w:t xml:space="preserve">from </w:t>
-      </w:r>
-      <w:proofErr w:type="spellStart"/>
-      <w:r>
-        <w:rPr>
-          <w:b/>
-          <w:bCs/>
-          <w:color w:val="D86DCB" w:themeColor="accent5" w:themeTint="99"/>
-          <w:sz w:val="32"/>
-          <w:szCs w:val="32"/>
-        </w:rPr>
-        <w:t>abc</w:t>
-      </w:r>
-      <w:proofErr w:type="spellEnd"/>
-      <w:r>
-        <w:rPr>
-          <w:b/>
-          <w:bCs/>
-          <w:color w:val="D86DCB" w:themeColor="accent5" w:themeTint="99"/>
-          <w:sz w:val="32"/>
-          <w:szCs w:val="32"/>
-        </w:rPr>
-        <w:t xml:space="preserve"> import ABC, </w:t>
-      </w:r>
-      <w:proofErr w:type="spellStart"/>
-      <w:r>
-        <w:rPr>
-          <w:b/>
-          <w:bCs/>
-          <w:color w:val="D86DCB" w:themeColor="accent5" w:themeTint="99"/>
-          <w:sz w:val="32"/>
-          <w:szCs w:val="32"/>
-        </w:rPr>
-        <w:t>abstractmethod</w:t>
-      </w:r>
-      <w:proofErr w:type="spellEnd"/>
     </w:p>
     <w:p>
       <w:pPr>
@@ -16772,7 +17505,6 @@
           <w:sz w:val="32"/>
           <w:szCs w:val="32"/>
         </w:rPr>
-        <w:lastRenderedPageBreak/>
         <w:t>class MFS(ABC):</w:t>
       </w:r>
       <w:r>
@@ -17137,6 +17869,7 @@
           <w:sz w:val="32"/>
           <w:szCs w:val="32"/>
         </w:rPr>
+        <w:lastRenderedPageBreak/>
         <w:t xml:space="preserve">        </w:t>
       </w:r>
     </w:p>
@@ -18032,6 +18765,7 @@
           <w:sz w:val="32"/>
           <w:szCs w:val="32"/>
         </w:rPr>
+        <w:lastRenderedPageBreak/>
         <w:t xml:space="preserve">    def fly(self):</w:t>
       </w:r>
     </w:p>
@@ -18315,7 +19049,6 @@
           <w:sz w:val="32"/>
           <w:szCs w:val="32"/>
         </w:rPr>
-        <w:lastRenderedPageBreak/>
         <w:t>Break</w:t>
       </w:r>
     </w:p>

</xml_diff>